<commit_message>
Implement advanced Kubernetes concepts (ConfigMaps, Secrets, health probes, CronJobs)
</commit_message>
<xml_diff>
--- a/assigement9_debug.docx
+++ b/assigement9_debug.docx
@@ -13,7 +13,7 @@
     <w:p>
       <w:r>
         <w:pict w14:anchorId="75E3F0CB">
-          <v:rect id="_x0000_i1043" style="width:0;height:1.5pt" o:hralign="center" o:hrstd="t" o:hr="t" fillcolor="#a0a0a0" stroked="f"/>
+          <v:rect id="_x0000_i1025" style="width:0;height:1.5pt" o:hralign="center" o:hrstd="t" o:hr="t" fillcolor="#a0a0a0" stroked="f"/>
         </w:pict>
       </w:r>
     </w:p>
@@ -1452,7 +1452,7 @@
     <w:p>
       <w:r>
         <w:pict w14:anchorId="4499A3F7">
-          <v:rect id="_x0000_i1044" style="width:0;height:1.5pt" o:hralign="center" o:hrstd="t" o:hr="t" fillcolor="#a0a0a0" stroked="f"/>
+          <v:rect id="_x0000_i1026" style="width:0;height:1.5pt" o:hralign="center" o:hrstd="t" o:hr="t" fillcolor="#a0a0a0" stroked="f"/>
         </w:pict>
       </w:r>
     </w:p>
@@ -2361,7 +2361,7 @@
     <w:p>
       <w:r>
         <w:pict w14:anchorId="55341D43">
-          <v:rect id="_x0000_i1045" style="width:0;height:1.5pt" o:hralign="center" o:hrstd="t" o:hr="t" fillcolor="#a0a0a0" stroked="f"/>
+          <v:rect id="_x0000_i1027" style="width:0;height:1.5pt" o:hralign="center" o:hrstd="t" o:hr="t" fillcolor="#a0a0a0" stroked="f"/>
         </w:pict>
       </w:r>
     </w:p>
@@ -2827,6 +2827,2376 @@
       </w:r>
       <w:r>
         <w:t>.</w:t>
+      </w:r>
+    </w:p>
+    <w:p>
+      <w:pPr>
+        <w:rPr>
+          <w:rtl/>
+        </w:rPr>
+      </w:pPr>
+    </w:p>
+    <w:p>
+      <w:pPr>
+        <w:rPr>
+          <w:b/>
+          <w:bCs/>
+        </w:rPr>
+      </w:pPr>
+      <w:r>
+        <w:rPr>
+          <w:b/>
+          <w:bCs/>
+          <w:rtl/>
+        </w:rPr>
+        <w:t>מה התקלה הייתה</w:t>
+      </w:r>
+      <w:r>
+        <w:rPr>
+          <w:b/>
+          <w:bCs/>
+        </w:rPr>
+        <w:t>?</w:t>
+      </w:r>
+    </w:p>
+    <w:p>
+      <w:r>
+        <w:rPr>
+          <w:rtl/>
+        </w:rPr>
+        <w:t>ה־</w:t>
+      </w:r>
+      <w:r>
+        <w:t xml:space="preserve">HPA </w:t>
+      </w:r>
+      <w:r>
+        <w:rPr>
+          <w:rtl/>
+        </w:rPr>
+        <w:t>שלך הראה</w:t>
+      </w:r>
+      <w:r>
+        <w:t>:</w:t>
+      </w:r>
+    </w:p>
+    <w:p>
+      <w:pPr>
+        <w:numPr>
+          <w:ilvl w:val="0"/>
+          <w:numId w:val="4"/>
+        </w:numPr>
+      </w:pPr>
+      <w:r>
+        <w:t>Metrics API not available</w:t>
+      </w:r>
+    </w:p>
+    <w:p>
+      <w:pPr>
+        <w:numPr>
+          <w:ilvl w:val="0"/>
+          <w:numId w:val="4"/>
+        </w:numPr>
+      </w:pPr>
+      <w:r>
+        <w:rPr>
+          <w:rtl/>
+        </w:rPr>
+        <w:t xml:space="preserve">או </w:t>
+      </w:r>
+      <w:proofErr w:type="spellStart"/>
+      <w:r>
+        <w:t>cpu</w:t>
+      </w:r>
+      <w:proofErr w:type="spellEnd"/>
+      <w:r>
+        <w:t xml:space="preserve"> &lt;unknown&gt;</w:t>
+      </w:r>
+    </w:p>
+    <w:p>
+      <w:pPr>
+        <w:numPr>
+          <w:ilvl w:val="0"/>
+          <w:numId w:val="4"/>
+        </w:numPr>
+      </w:pPr>
+      <w:r>
+        <w:rPr>
+          <w:rtl/>
+        </w:rPr>
+        <w:t xml:space="preserve">או </w:t>
+      </w:r>
+      <w:r>
+        <w:t xml:space="preserve">missing request for </w:t>
+      </w:r>
+      <w:proofErr w:type="spellStart"/>
+      <w:r>
+        <w:t>cpu</w:t>
+      </w:r>
+      <w:proofErr w:type="spellEnd"/>
+      <w:r>
+        <w:br/>
+      </w:r>
+      <w:r>
+        <w:rPr>
+          <w:rtl/>
+        </w:rPr>
+        <w:t>ובמקביל הפודים של האפליקציה נכנסו ל־</w:t>
+      </w:r>
+      <w:proofErr w:type="spellStart"/>
+      <w:r>
+        <w:t>CrashLoopBackOff</w:t>
+      </w:r>
+      <w:proofErr w:type="spellEnd"/>
+      <w:r>
+        <w:t>.</w:t>
+      </w:r>
+    </w:p>
+    <w:p>
+      <w:r>
+        <w:rPr>
+          <w:rtl/>
+        </w:rPr>
+        <w:t>כל עוד פוד נופל/לא</w:t>
+      </w:r>
+      <w:r>
+        <w:t xml:space="preserve"> Ready — </w:t>
+      </w:r>
+      <w:r>
+        <w:rPr>
+          <w:rtl/>
+        </w:rPr>
+        <w:t>אין לו</w:t>
+      </w:r>
+      <w:r>
+        <w:t xml:space="preserve"> metrics, </w:t>
+      </w:r>
+      <w:r>
+        <w:rPr>
+          <w:rtl/>
+        </w:rPr>
+        <w:t>ואז</w:t>
+      </w:r>
+      <w:r>
+        <w:t xml:space="preserve"> HPA </w:t>
+      </w:r>
+      <w:r>
+        <w:rPr>
+          <w:rtl/>
+        </w:rPr>
+        <w:t>לא יכול לחשב</w:t>
+      </w:r>
+      <w:r>
+        <w:t xml:space="preserve"> CPU.</w:t>
+      </w:r>
+    </w:p>
+    <w:p>
+      <w:r>
+        <w:pict w14:anchorId="1D224F9A">
+          <v:rect id="_x0000_i1058" style="width:0;height:1.5pt" o:hralign="center" o:hrstd="t" o:hr="t" fillcolor="#a0a0a0" stroked="f"/>
+        </w:pict>
+      </w:r>
+    </w:p>
+    <w:p>
+      <w:pPr>
+        <w:rPr>
+          <w:b/>
+          <w:bCs/>
+        </w:rPr>
+      </w:pPr>
+      <w:r>
+        <w:rPr>
+          <w:b/>
+          <w:bCs/>
+          <w:rtl/>
+        </w:rPr>
+        <w:t>מה גילינו בדרך</w:t>
+      </w:r>
+      <w:r>
+        <w:rPr>
+          <w:b/>
+          <w:bCs/>
+        </w:rPr>
+        <w:t>?</w:t>
+      </w:r>
+    </w:p>
+    <w:p>
+      <w:pPr>
+        <w:rPr>
+          <w:b/>
+          <w:bCs/>
+        </w:rPr>
+      </w:pPr>
+      <w:r>
+        <w:rPr>
+          <w:b/>
+          <w:bCs/>
+        </w:rPr>
+        <w:t xml:space="preserve">1) </w:t>
+      </w:r>
+      <w:r>
+        <w:rPr>
+          <w:b/>
+          <w:bCs/>
+          <w:rtl/>
+        </w:rPr>
+        <w:t>לא היה</w:t>
+      </w:r>
+      <w:r>
+        <w:rPr>
+          <w:b/>
+          <w:bCs/>
+        </w:rPr>
+        <w:t xml:space="preserve"> Metrics Server</w:t>
+      </w:r>
+    </w:p>
+    <w:p>
+      <w:r>
+        <w:rPr>
+          <w:rtl/>
+        </w:rPr>
+        <w:t xml:space="preserve">בהתחלה </w:t>
+      </w:r>
+      <w:proofErr w:type="spellStart"/>
+      <w:r>
+        <w:t>kubectl</w:t>
+      </w:r>
+      <w:proofErr w:type="spellEnd"/>
+      <w:r>
+        <w:t xml:space="preserve"> top nodes/pods </w:t>
+      </w:r>
+      <w:r>
+        <w:rPr>
+          <w:rtl/>
+        </w:rPr>
+        <w:t>החזיר</w:t>
+      </w:r>
+      <w:r>
+        <w:t>:</w:t>
+      </w:r>
+      <w:r>
+        <w:br/>
+        <w:t>Metrics API not available</w:t>
+      </w:r>
+    </w:p>
+    <w:p>
+      <w:r>
+        <w:rPr>
+          <w:rtl/>
+        </w:rPr>
+        <w:t>כלומר</w:t>
+      </w:r>
+      <w:r>
+        <w:t xml:space="preserve"> Kubernetes </w:t>
+      </w:r>
+      <w:r>
+        <w:rPr>
+          <w:rtl/>
+        </w:rPr>
+        <w:t>לא ידע למדוד</w:t>
+      </w:r>
+      <w:r>
+        <w:t xml:space="preserve"> CPU/Mem → </w:t>
+      </w:r>
+      <w:r>
+        <w:rPr>
+          <w:rtl/>
+        </w:rPr>
+        <w:t>לכן</w:t>
+      </w:r>
+      <w:r>
+        <w:t xml:space="preserve"> HPA </w:t>
+      </w:r>
+      <w:r>
+        <w:rPr>
+          <w:rtl/>
+        </w:rPr>
+        <w:t>לא יכול לעבוד</w:t>
+      </w:r>
+      <w:r>
+        <w:t>.</w:t>
+      </w:r>
+    </w:p>
+    <w:p>
+      <w:r>
+        <w:rPr>
+          <w:rFonts w:ascii="Segoe UI Emoji" w:hAnsi="Segoe UI Emoji" w:cs="Segoe UI Emoji"/>
+        </w:rPr>
+        <w:t>✅</w:t>
+      </w:r>
+      <w:r>
+        <w:t xml:space="preserve"> </w:t>
+      </w:r>
+      <w:r>
+        <w:rPr>
+          <w:rtl/>
+        </w:rPr>
+        <w:t>פתרנו ע״י התקנת</w:t>
+      </w:r>
+      <w:r>
+        <w:t xml:space="preserve"> metrics-server (</w:t>
+      </w:r>
+      <w:r>
+        <w:rPr>
+          <w:rtl/>
+        </w:rPr>
+        <w:t>ובדוקר דסקטופ לפעמים צריך</w:t>
+      </w:r>
+      <w:r>
+        <w:t xml:space="preserve"> flags), </w:t>
+      </w:r>
+      <w:r>
+        <w:rPr>
+          <w:rtl/>
+        </w:rPr>
+        <w:t>ואז</w:t>
+      </w:r>
+      <w:r>
+        <w:t>:</w:t>
+      </w:r>
+      <w:r>
+        <w:br/>
+      </w:r>
+      <w:proofErr w:type="spellStart"/>
+      <w:r>
+        <w:t>kubectl</w:t>
+      </w:r>
+      <w:proofErr w:type="spellEnd"/>
+      <w:r>
+        <w:t xml:space="preserve"> top pods </w:t>
+      </w:r>
+      <w:r>
+        <w:rPr>
+          <w:rtl/>
+        </w:rPr>
+        <w:t>התחיל לעבוד</w:t>
+      </w:r>
+      <w:r>
+        <w:t>.</w:t>
+      </w:r>
+    </w:p>
+    <w:p>
+      <w:r>
+        <w:pict w14:anchorId="48548F40">
+          <v:rect id="_x0000_i1059" style="width:0;height:1.5pt" o:hralign="center" o:hrstd="t" o:hr="t" fillcolor="#a0a0a0" stroked="f"/>
+        </w:pict>
+      </w:r>
+    </w:p>
+    <w:p>
+      <w:pPr>
+        <w:rPr>
+          <w:b/>
+          <w:bCs/>
+        </w:rPr>
+      </w:pPr>
+      <w:r>
+        <w:rPr>
+          <w:b/>
+          <w:bCs/>
+        </w:rPr>
+        <w:t xml:space="preserve">2) </w:t>
+      </w:r>
+      <w:r>
+        <w:rPr>
+          <w:b/>
+          <w:bCs/>
+          <w:rtl/>
+        </w:rPr>
+        <w:t>ה־</w:t>
+      </w:r>
+      <w:r>
+        <w:rPr>
+          <w:b/>
+          <w:bCs/>
+        </w:rPr>
+        <w:t xml:space="preserve">Deployment </w:t>
+      </w:r>
+      <w:r>
+        <w:rPr>
+          <w:b/>
+          <w:bCs/>
+          <w:rtl/>
+        </w:rPr>
+        <w:t>שלך הפיל את הקונטיינר בכוונה</w:t>
+      </w:r>
+    </w:p>
+    <w:p>
+      <w:r>
+        <w:rPr>
+          <w:rtl/>
+        </w:rPr>
+        <w:t xml:space="preserve">מצאנו </w:t>
+      </w:r>
+      <w:proofErr w:type="spellStart"/>
+      <w:r>
+        <w:rPr>
+          <w:rtl/>
+        </w:rPr>
+        <w:t>שבפוד</w:t>
+      </w:r>
+      <w:proofErr w:type="spellEnd"/>
+      <w:r>
+        <w:rPr>
+          <w:rtl/>
+        </w:rPr>
+        <w:t xml:space="preserve"> רץ</w:t>
+      </w:r>
+      <w:r>
+        <w:t>:</w:t>
+      </w:r>
+    </w:p>
+    <w:p>
+      <w:r>
+        <w:t>command: ["</w:t>
+      </w:r>
+      <w:proofErr w:type="spellStart"/>
+      <w:r>
+        <w:t>sh</w:t>
+      </w:r>
+      <w:proofErr w:type="spellEnd"/>
+      <w:r>
+        <w:t>","-</w:t>
+      </w:r>
+      <w:proofErr w:type="spellStart"/>
+      <w:r>
+        <w:t>c","exit</w:t>
+      </w:r>
+      <w:proofErr w:type="spellEnd"/>
+      <w:r>
+        <w:t xml:space="preserve"> 1"]</w:t>
+      </w:r>
+    </w:p>
+    <w:p>
+      <w:r>
+        <w:rPr>
+          <w:rtl/>
+        </w:rPr>
+        <w:t>וזה גורם לקונטיינר לצאת מייד עם</w:t>
+      </w:r>
+      <w:r>
+        <w:t xml:space="preserve"> Exit Code 1 → </w:t>
+      </w:r>
+      <w:r>
+        <w:rPr>
+          <w:rtl/>
+        </w:rPr>
+        <w:t xml:space="preserve">ואז </w:t>
+      </w:r>
+      <w:proofErr w:type="spellStart"/>
+      <w:r>
+        <w:rPr>
+          <w:rtl/>
+        </w:rPr>
+        <w:t>הפוד</w:t>
+      </w:r>
+      <w:proofErr w:type="spellEnd"/>
+      <w:r>
+        <w:rPr>
+          <w:rtl/>
+        </w:rPr>
+        <w:t xml:space="preserve"> נכנס ל־</w:t>
+      </w:r>
+      <w:proofErr w:type="spellStart"/>
+      <w:r>
+        <w:t>CrashLoopBackOff</w:t>
+      </w:r>
+      <w:proofErr w:type="spellEnd"/>
+      <w:r>
+        <w:t>.</w:t>
+      </w:r>
+    </w:p>
+    <w:p>
+      <w:r>
+        <w:rPr>
+          <w:rFonts w:ascii="Segoe UI Emoji" w:hAnsi="Segoe UI Emoji" w:cs="Segoe UI Emoji"/>
+        </w:rPr>
+        <w:lastRenderedPageBreak/>
+        <w:t>✅</w:t>
+      </w:r>
+      <w:r>
+        <w:t xml:space="preserve"> </w:t>
+      </w:r>
+      <w:r>
+        <w:rPr>
+          <w:rtl/>
+        </w:rPr>
+        <w:t>פתרנו ע״י הסרה של ה־</w:t>
+      </w:r>
+      <w:r>
+        <w:t xml:space="preserve">command </w:t>
+      </w:r>
+      <w:r>
+        <w:rPr>
+          <w:rtl/>
+        </w:rPr>
+        <w:t>הזה מה־</w:t>
+      </w:r>
+      <w:r>
+        <w:t xml:space="preserve">Deployment, </w:t>
+      </w:r>
+      <w:r>
+        <w:rPr>
+          <w:rtl/>
+        </w:rPr>
+        <w:t>כדי שהקונטיינר יריץ את ה־</w:t>
+      </w:r>
+      <w:r>
+        <w:t xml:space="preserve">CMD </w:t>
+      </w:r>
+      <w:r>
+        <w:rPr>
+          <w:rtl/>
+        </w:rPr>
+        <w:t>המקורי של ה</w:t>
+      </w:r>
+      <w:r>
+        <w:t>-image.</w:t>
+      </w:r>
+    </w:p>
+    <w:p>
+      <w:r>
+        <w:pict w14:anchorId="6F086EF3">
+          <v:rect id="_x0000_i1060" style="width:0;height:1.5pt" o:hralign="center" o:hrstd="t" o:hr="t" fillcolor="#a0a0a0" stroked="f"/>
+        </w:pict>
+      </w:r>
+    </w:p>
+    <w:p>
+      <w:pPr>
+        <w:rPr>
+          <w:b/>
+          <w:bCs/>
+        </w:rPr>
+      </w:pPr>
+      <w:r>
+        <w:rPr>
+          <w:b/>
+          <w:bCs/>
+        </w:rPr>
+        <w:t xml:space="preserve">3) </w:t>
+      </w:r>
+      <w:proofErr w:type="spellStart"/>
+      <w:r>
+        <w:rPr>
+          <w:b/>
+          <w:bCs/>
+        </w:rPr>
+        <w:t>ArgoCD</w:t>
+      </w:r>
+      <w:proofErr w:type="spellEnd"/>
+      <w:r>
+        <w:rPr>
+          <w:b/>
+          <w:bCs/>
+        </w:rPr>
+        <w:t xml:space="preserve"> </w:t>
+      </w:r>
+      <w:r>
+        <w:rPr>
+          <w:b/>
+          <w:bCs/>
+          <w:rtl/>
+        </w:rPr>
+        <w:t>החזיר את התקלה כל פעם</w:t>
+      </w:r>
+    </w:p>
+    <w:p>
+      <w:r>
+        <w:rPr>
+          <w:rtl/>
+        </w:rPr>
+        <w:t>גם אחרי שהסרנו את ה־</w:t>
+      </w:r>
+      <w:r>
+        <w:t xml:space="preserve">exit 1 </w:t>
+      </w:r>
+      <w:r>
+        <w:rPr>
+          <w:rtl/>
+        </w:rPr>
+        <w:t>מקומית, ראינו שזה חוזר</w:t>
+      </w:r>
+      <w:r>
+        <w:t>.</w:t>
+      </w:r>
+    </w:p>
+    <w:p>
+      <w:r>
+        <w:rPr>
+          <w:rtl/>
+        </w:rPr>
+        <w:t>למה? כי ה־</w:t>
+      </w:r>
+      <w:r>
+        <w:t xml:space="preserve">Deployment </w:t>
+      </w:r>
+      <w:r>
+        <w:rPr>
+          <w:rtl/>
+        </w:rPr>
+        <w:t xml:space="preserve">נשלט ע״י </w:t>
+      </w:r>
+      <w:proofErr w:type="spellStart"/>
+      <w:r>
+        <w:rPr>
+          <w:b/>
+          <w:bCs/>
+        </w:rPr>
+        <w:t>ArgoCD</w:t>
+      </w:r>
+      <w:proofErr w:type="spellEnd"/>
+      <w:r>
+        <w:t xml:space="preserve"> </w:t>
+      </w:r>
+      <w:r>
+        <w:rPr>
+          <w:rtl/>
+        </w:rPr>
+        <w:t>עם</w:t>
+      </w:r>
+      <w:r>
+        <w:t>:</w:t>
+      </w:r>
+    </w:p>
+    <w:p>
+      <w:pPr>
+        <w:numPr>
+          <w:ilvl w:val="0"/>
+          <w:numId w:val="5"/>
+        </w:numPr>
+      </w:pPr>
+      <w:proofErr w:type="spellStart"/>
+      <w:r>
+        <w:t>selfHeal</w:t>
+      </w:r>
+      <w:proofErr w:type="spellEnd"/>
+      <w:r>
+        <w:t>: true</w:t>
+      </w:r>
+    </w:p>
+    <w:p>
+      <w:pPr>
+        <w:numPr>
+          <w:ilvl w:val="0"/>
+          <w:numId w:val="5"/>
+        </w:numPr>
+      </w:pPr>
+      <w:r>
+        <w:t>path</w:t>
+      </w:r>
+      <w:proofErr w:type="gramStart"/>
+      <w:r>
+        <w:t>: .</w:t>
+      </w:r>
+      <w:proofErr w:type="gramEnd"/>
+      <w:r>
+        <w:t xml:space="preserve"> (</w:t>
+      </w:r>
+      <w:r>
+        <w:rPr>
+          <w:rtl/>
+        </w:rPr>
+        <w:t>מסנכרן מה־</w:t>
+      </w:r>
+      <w:r>
+        <w:t>Git)</w:t>
+      </w:r>
+    </w:p>
+    <w:p>
+      <w:r>
+        <w:rPr>
+          <w:rtl/>
+        </w:rPr>
+        <w:t>כל שינוי ידני שעשינו עם</w:t>
+      </w:r>
+      <w:r>
+        <w:t xml:space="preserve"> </w:t>
+      </w:r>
+      <w:proofErr w:type="spellStart"/>
+      <w:r>
+        <w:t>kubectl</w:t>
+      </w:r>
+      <w:proofErr w:type="spellEnd"/>
+      <w:r>
+        <w:t xml:space="preserve"> — Argo </w:t>
+      </w:r>
+      <w:r>
+        <w:rPr>
+          <w:rtl/>
+        </w:rPr>
+        <w:t>החזיר אחורה למצב שב־</w:t>
+      </w:r>
+      <w:r>
+        <w:t>Git.</w:t>
+      </w:r>
+    </w:p>
+    <w:p>
+      <w:r>
+        <w:rPr>
+          <w:rFonts w:ascii="Segoe UI Emoji" w:hAnsi="Segoe UI Emoji" w:cs="Segoe UI Emoji"/>
+        </w:rPr>
+        <w:t>✅</w:t>
+      </w:r>
+      <w:r>
+        <w:t xml:space="preserve"> </w:t>
+      </w:r>
+      <w:r>
+        <w:rPr>
+          <w:rtl/>
+        </w:rPr>
+        <w:t>פתרנו ע״י תיקון המניפסט בריפו</w:t>
+      </w:r>
+      <w:r>
+        <w:t xml:space="preserve"> (commit + push), </w:t>
+      </w:r>
+      <w:r>
+        <w:rPr>
+          <w:rtl/>
+        </w:rPr>
+        <w:t>ואז</w:t>
+      </w:r>
+      <w:r>
+        <w:t xml:space="preserve"> Argo </w:t>
+      </w:r>
+      <w:proofErr w:type="spellStart"/>
+      <w:r>
+        <w:rPr>
+          <w:rtl/>
+        </w:rPr>
+        <w:t>סינכרן</w:t>
+      </w:r>
+      <w:proofErr w:type="spellEnd"/>
+      <w:r>
+        <w:rPr>
+          <w:rtl/>
+        </w:rPr>
+        <w:t xml:space="preserve"> את הגרסה התקינה </w:t>
+      </w:r>
+      <w:proofErr w:type="spellStart"/>
+      <w:r>
+        <w:rPr>
+          <w:rtl/>
+        </w:rPr>
+        <w:t>לקלאסטר</w:t>
+      </w:r>
+      <w:proofErr w:type="spellEnd"/>
+      <w:r>
+        <w:t>.</w:t>
+      </w:r>
+    </w:p>
+    <w:p>
+      <w:r>
+        <w:pict w14:anchorId="31956547">
+          <v:rect id="_x0000_i1061" style="width:0;height:1.5pt" o:hralign="center" o:hrstd="t" o:hr="t" fillcolor="#a0a0a0" stroked="f"/>
+        </w:pict>
+      </w:r>
+    </w:p>
+    <w:p>
+      <w:pPr>
+        <w:rPr>
+          <w:b/>
+          <w:bCs/>
+        </w:rPr>
+      </w:pPr>
+      <w:r>
+        <w:rPr>
+          <w:b/>
+          <w:bCs/>
+        </w:rPr>
+        <w:t xml:space="preserve">4) </w:t>
+      </w:r>
+      <w:r>
+        <w:rPr>
+          <w:b/>
+          <w:bCs/>
+          <w:rtl/>
+        </w:rPr>
+        <w:t>הוספנו</w:t>
+      </w:r>
+      <w:r>
+        <w:rPr>
+          <w:b/>
+          <w:bCs/>
+        </w:rPr>
+        <w:t xml:space="preserve"> Requests CPU </w:t>
+      </w:r>
+      <w:r>
+        <w:rPr>
+          <w:b/>
+          <w:bCs/>
+          <w:rtl/>
+        </w:rPr>
+        <w:t>בשביל</w:t>
+      </w:r>
+      <w:r>
+        <w:rPr>
+          <w:b/>
+          <w:bCs/>
+        </w:rPr>
+        <w:t xml:space="preserve"> HPA</w:t>
+      </w:r>
+    </w:p>
+    <w:p>
+      <w:r>
+        <w:t xml:space="preserve">HPA </w:t>
+      </w:r>
+      <w:r>
+        <w:rPr>
+          <w:rtl/>
+        </w:rPr>
+        <w:t>לפי</w:t>
+      </w:r>
+      <w:r>
+        <w:t xml:space="preserve"> CPU </w:t>
+      </w:r>
+      <w:r>
+        <w:rPr>
+          <w:rtl/>
+        </w:rPr>
+        <w:t>עובד רק אם מוגדרים</w:t>
+      </w:r>
+      <w:r>
+        <w:t>:</w:t>
+      </w:r>
+    </w:p>
+    <w:p>
+      <w:r>
+        <w:t>resources:</w:t>
+      </w:r>
+    </w:p>
+    <w:p>
+      <w:r>
+        <w:t xml:space="preserve">  requests:</w:t>
+      </w:r>
+    </w:p>
+    <w:p>
+      <w:r>
+        <w:t xml:space="preserve">    </w:t>
+      </w:r>
+      <w:proofErr w:type="spellStart"/>
+      <w:r>
+        <w:t>cpu</w:t>
+      </w:r>
+      <w:proofErr w:type="spellEnd"/>
+      <w:r>
+        <w:t>: "100m"</w:t>
+      </w:r>
+    </w:p>
+    <w:p>
+      <w:r>
+        <w:rPr>
+          <w:rtl/>
+        </w:rPr>
+        <w:t>בלי זה</w:t>
+      </w:r>
+      <w:r>
+        <w:t xml:space="preserve"> HPA </w:t>
+      </w:r>
+      <w:r>
+        <w:rPr>
+          <w:rtl/>
+        </w:rPr>
+        <w:t>לא יודע לחשב “אחוז מתוך</w:t>
+      </w:r>
+      <w:r>
+        <w:t xml:space="preserve"> request” </w:t>
+      </w:r>
+      <w:r>
+        <w:rPr>
+          <w:rtl/>
+        </w:rPr>
+        <w:t>ולכן הוא זורק</w:t>
+      </w:r>
+      <w:r>
+        <w:t>:</w:t>
+      </w:r>
+      <w:r>
+        <w:br/>
+        <w:t xml:space="preserve">missing request for </w:t>
+      </w:r>
+      <w:proofErr w:type="spellStart"/>
+      <w:r>
+        <w:t>cpu</w:t>
+      </w:r>
+      <w:proofErr w:type="spellEnd"/>
+    </w:p>
+    <w:p>
+      <w:r>
+        <w:rPr>
+          <w:rFonts w:ascii="Segoe UI Emoji" w:hAnsi="Segoe UI Emoji" w:cs="Segoe UI Emoji"/>
+        </w:rPr>
+        <w:t>✅</w:t>
+      </w:r>
+      <w:r>
+        <w:t xml:space="preserve"> </w:t>
+      </w:r>
+      <w:r>
+        <w:rPr>
+          <w:rtl/>
+        </w:rPr>
+        <w:t xml:space="preserve">פתרנו ע״י הוספת </w:t>
+      </w:r>
+      <w:r>
+        <w:t>requests (</w:t>
+      </w:r>
+      <w:r>
+        <w:rPr>
+          <w:rtl/>
+        </w:rPr>
+        <w:t>וגם</w:t>
+      </w:r>
+      <w:r>
+        <w:t xml:space="preserve"> limits) </w:t>
+      </w:r>
+      <w:r>
+        <w:rPr>
+          <w:rtl/>
+        </w:rPr>
+        <w:t>ב־</w:t>
+      </w:r>
+      <w:r>
+        <w:t>Deployment.</w:t>
+      </w:r>
+    </w:p>
+    <w:p>
+      <w:r>
+        <w:pict w14:anchorId="4B5B1827">
+          <v:rect id="_x0000_i1062" style="width:0;height:1.5pt" o:hralign="center" o:hrstd="t" o:hr="t" fillcolor="#a0a0a0" stroked="f"/>
+        </w:pict>
+      </w:r>
+    </w:p>
+    <w:p>
+      <w:pPr>
+        <w:rPr>
+          <w:b/>
+          <w:bCs/>
+        </w:rPr>
+      </w:pPr>
+      <w:r>
+        <w:rPr>
+          <w:b/>
+          <w:bCs/>
+          <w:rtl/>
+        </w:rPr>
+        <w:t xml:space="preserve">איך יודעים </w:t>
+      </w:r>
+      <w:proofErr w:type="spellStart"/>
+      <w:r>
+        <w:rPr>
+          <w:b/>
+          <w:bCs/>
+          <w:rtl/>
+        </w:rPr>
+        <w:t>שהכל</w:t>
+      </w:r>
+      <w:proofErr w:type="spellEnd"/>
+      <w:r>
+        <w:rPr>
+          <w:b/>
+          <w:bCs/>
+          <w:rtl/>
+        </w:rPr>
+        <w:t xml:space="preserve"> באמת תוקן</w:t>
+      </w:r>
+      <w:r>
+        <w:rPr>
+          <w:b/>
+          <w:bCs/>
+        </w:rPr>
+        <w:t>?</w:t>
+      </w:r>
+    </w:p>
+    <w:p>
+      <w:r>
+        <w:rPr>
+          <w:rtl/>
+        </w:rPr>
+        <w:t>כי עכשיו</w:t>
+      </w:r>
+      <w:r>
+        <w:t>:</w:t>
+      </w:r>
+    </w:p>
+    <w:p>
+      <w:pPr>
+        <w:numPr>
+          <w:ilvl w:val="0"/>
+          <w:numId w:val="6"/>
+        </w:numPr>
+      </w:pPr>
+      <w:proofErr w:type="spellStart"/>
+      <w:r>
+        <w:rPr>
+          <w:rtl/>
+        </w:rPr>
+        <w:t>הפוד</w:t>
+      </w:r>
+      <w:proofErr w:type="spellEnd"/>
+      <w:r>
+        <w:rPr>
+          <w:rtl/>
+        </w:rPr>
+        <w:t xml:space="preserve"> </w:t>
+      </w:r>
+      <w:r>
+        <w:rPr>
+          <w:b/>
+          <w:bCs/>
+        </w:rPr>
+        <w:t>Running + Ready</w:t>
+      </w:r>
+    </w:p>
+    <w:p>
+      <w:pPr>
+        <w:numPr>
+          <w:ilvl w:val="0"/>
+          <w:numId w:val="6"/>
+        </w:numPr>
+      </w:pPr>
+      <w:proofErr w:type="spellStart"/>
+      <w:r>
+        <w:t>kubectl</w:t>
+      </w:r>
+      <w:proofErr w:type="spellEnd"/>
+      <w:r>
+        <w:t xml:space="preserve"> top pods </w:t>
+      </w:r>
+      <w:r>
+        <w:rPr>
+          <w:rtl/>
+        </w:rPr>
+        <w:t>עובד ומראה</w:t>
+      </w:r>
+      <w:r>
+        <w:t xml:space="preserve"> CPU</w:t>
+      </w:r>
+    </w:p>
+    <w:p>
+      <w:pPr>
+        <w:numPr>
+          <w:ilvl w:val="0"/>
+          <w:numId w:val="6"/>
+        </w:numPr>
+      </w:pPr>
+      <w:proofErr w:type="spellStart"/>
+      <w:r>
+        <w:lastRenderedPageBreak/>
+        <w:t>kubectl</w:t>
+      </w:r>
+      <w:proofErr w:type="spellEnd"/>
+      <w:r>
+        <w:t xml:space="preserve"> describe </w:t>
+      </w:r>
+      <w:proofErr w:type="spellStart"/>
+      <w:r>
+        <w:t>hpa</w:t>
+      </w:r>
+      <w:proofErr w:type="spellEnd"/>
+      <w:r>
+        <w:t xml:space="preserve"> </w:t>
+      </w:r>
+      <w:r>
+        <w:rPr>
+          <w:rtl/>
+        </w:rPr>
+        <w:t>מראה</w:t>
+      </w:r>
+      <w:r>
+        <w:t>:</w:t>
+      </w:r>
+      <w:r>
+        <w:br/>
+        <w:t>1% (1m) / 60%</w:t>
+      </w:r>
+      <w:r>
+        <w:br/>
+      </w:r>
+      <w:r>
+        <w:rPr>
+          <w:rtl/>
+        </w:rPr>
+        <w:t>כלומר</w:t>
+      </w:r>
+      <w:r>
+        <w:t xml:space="preserve"> HPA </w:t>
+      </w:r>
+      <w:r>
+        <w:rPr>
+          <w:rtl/>
+        </w:rPr>
+        <w:t>כן מודד</w:t>
+      </w:r>
+      <w:r>
+        <w:t xml:space="preserve"> CPU </w:t>
+      </w:r>
+      <w:r>
+        <w:rPr>
+          <w:rtl/>
+        </w:rPr>
+        <w:t>ויכול להחליט להגדיל/להקטין</w:t>
+      </w:r>
+      <w:r>
+        <w:t>.</w:t>
+      </w:r>
+    </w:p>
+    <w:p>
+      <w:pPr>
+        <w:rPr>
+          <w:rtl/>
+        </w:rPr>
+      </w:pPr>
+    </w:p>
+    <w:p>
+      <w:pPr>
+        <w:rPr>
+          <w:rtl/>
+        </w:rPr>
+      </w:pPr>
+    </w:p>
+    <w:p>
+      <w:pPr>
+        <w:rPr>
+          <w:b/>
+          <w:bCs/>
+        </w:rPr>
+      </w:pPr>
+      <w:r>
+        <w:rPr>
+          <w:rFonts w:ascii="Segoe UI Emoji" w:hAnsi="Segoe UI Emoji" w:cs="Segoe UI Emoji"/>
+          <w:b/>
+          <w:bCs/>
+        </w:rPr>
+        <w:t>🎯</w:t>
+      </w:r>
+      <w:r>
+        <w:rPr>
+          <w:b/>
+          <w:bCs/>
+        </w:rPr>
+        <w:t xml:space="preserve"> </w:t>
+      </w:r>
+      <w:r>
+        <w:rPr>
+          <w:b/>
+          <w:bCs/>
+          <w:rtl/>
+        </w:rPr>
+        <w:t>מה הייתה המטרה של כל המשימה הזאת</w:t>
+      </w:r>
+      <w:r>
+        <w:rPr>
+          <w:b/>
+          <w:bCs/>
+        </w:rPr>
+        <w:t>?</w:t>
+      </w:r>
+    </w:p>
+    <w:p>
+      <w:r>
+        <w:rPr>
+          <w:rtl/>
+        </w:rPr>
+        <w:t>המטרה הייתה</w:t>
+      </w:r>
+      <w:r>
+        <w:t>:</w:t>
+      </w:r>
+    </w:p>
+    <w:p>
+      <w:r>
+        <w:rPr>
+          <w:rFonts w:ascii="Segoe UI Emoji" w:hAnsi="Segoe UI Emoji" w:cs="Segoe UI Emoji"/>
+        </w:rPr>
+        <w:t>👉</w:t>
+      </w:r>
+      <w:r>
+        <w:t xml:space="preserve"> </w:t>
+      </w:r>
+      <w:r>
+        <w:rPr>
+          <w:b/>
+          <w:bCs/>
+          <w:rtl/>
+        </w:rPr>
+        <w:t>להראות שהאפליקציה שלך יכולה לגדול ולהצטמצם אוטומטית לפי עומס</w:t>
+      </w:r>
+      <w:r>
+        <w:br/>
+      </w:r>
+      <w:r>
+        <w:rPr>
+          <w:rtl/>
+        </w:rPr>
+        <w:t xml:space="preserve">כמו מערכת אמיתית </w:t>
+      </w:r>
+      <w:proofErr w:type="spellStart"/>
+      <w:r>
+        <w:rPr>
+          <w:rtl/>
+        </w:rPr>
+        <w:t>בפרודקשן</w:t>
+      </w:r>
+      <w:proofErr w:type="spellEnd"/>
+      <w:r>
+        <w:t>.</w:t>
+      </w:r>
+    </w:p>
+    <w:p>
+      <w:r>
+        <w:rPr>
+          <w:rtl/>
+        </w:rPr>
+        <w:t>כלומר</w:t>
+      </w:r>
+      <w:r>
+        <w:t>:</w:t>
+      </w:r>
+    </w:p>
+    <w:p>
+      <w:pPr>
+        <w:numPr>
+          <w:ilvl w:val="0"/>
+          <w:numId w:val="7"/>
+        </w:numPr>
+      </w:pPr>
+      <w:r>
+        <w:rPr>
+          <w:rtl/>
+        </w:rPr>
+        <w:t>כשיש מעט משתמשים → מספיק</w:t>
+      </w:r>
+      <w:r>
+        <w:t xml:space="preserve"> Pod </w:t>
+      </w:r>
+      <w:r>
+        <w:rPr>
+          <w:rtl/>
+        </w:rPr>
+        <w:t>אחד</w:t>
+      </w:r>
+    </w:p>
+    <w:p>
+      <w:pPr>
+        <w:numPr>
+          <w:ilvl w:val="0"/>
+          <w:numId w:val="7"/>
+        </w:numPr>
+      </w:pPr>
+      <w:r>
+        <w:rPr>
+          <w:rtl/>
+        </w:rPr>
+        <w:t>כשיש הרבה משתמשים</w:t>
+      </w:r>
+      <w:r>
+        <w:t xml:space="preserve"> → Kubernetes </w:t>
+      </w:r>
+      <w:r>
+        <w:rPr>
+          <w:rtl/>
+        </w:rPr>
+        <w:t>מרים עוד</w:t>
+      </w:r>
+      <w:r>
+        <w:t xml:space="preserve"> Pods </w:t>
+      </w:r>
+      <w:r>
+        <w:rPr>
+          <w:rtl/>
+        </w:rPr>
+        <w:t>לבד</w:t>
+      </w:r>
+    </w:p>
+    <w:p>
+      <w:pPr>
+        <w:numPr>
+          <w:ilvl w:val="0"/>
+          <w:numId w:val="7"/>
+        </w:numPr>
+      </w:pPr>
+      <w:r>
+        <w:rPr>
+          <w:rtl/>
+        </w:rPr>
+        <w:t>כשנגמר העומס → הוא מוריד</w:t>
+      </w:r>
+      <w:r>
+        <w:t xml:space="preserve"> Pods </w:t>
+      </w:r>
+      <w:r>
+        <w:rPr>
+          <w:rtl/>
+        </w:rPr>
+        <w:t>כדי לא לבזבז משאבים</w:t>
+      </w:r>
+    </w:p>
+    <w:p>
+      <w:r>
+        <w:rPr>
+          <w:rtl/>
+        </w:rPr>
+        <w:t xml:space="preserve">זה נקרא </w:t>
+      </w:r>
+      <w:r>
+        <w:rPr>
+          <w:b/>
+          <w:bCs/>
+        </w:rPr>
+        <w:t>Horizontal Pod Autoscaling (HPA)</w:t>
+      </w:r>
+      <w:r>
+        <w:t>.</w:t>
+      </w:r>
+    </w:p>
+    <w:p>
+      <w:r>
+        <w:pict w14:anchorId="70202F89">
+          <v:rect id="_x0000_i1074" style="width:0;height:1.5pt" o:hralign="center" o:hrstd="t" o:hr="t" fillcolor="#a0a0a0" stroked="f"/>
+        </w:pict>
+      </w:r>
+    </w:p>
+    <w:p>
+      <w:pPr>
+        <w:rPr>
+          <w:b/>
+          <w:bCs/>
+        </w:rPr>
+      </w:pPr>
+      <w:r>
+        <w:rPr>
+          <w:rFonts w:ascii="Segoe UI Emoji" w:hAnsi="Segoe UI Emoji" w:cs="Segoe UI Emoji"/>
+          <w:b/>
+          <w:bCs/>
+        </w:rPr>
+        <w:t>🔧</w:t>
+      </w:r>
+      <w:r>
+        <w:rPr>
+          <w:b/>
+          <w:bCs/>
+        </w:rPr>
+        <w:t xml:space="preserve"> </w:t>
+      </w:r>
+      <w:r>
+        <w:rPr>
+          <w:b/>
+          <w:bCs/>
+          <w:rtl/>
+        </w:rPr>
+        <w:t>מה בנינו בפועל</w:t>
+      </w:r>
+      <w:r>
+        <w:rPr>
+          <w:b/>
+          <w:bCs/>
+        </w:rPr>
+        <w:t>?</w:t>
+      </w:r>
+    </w:p>
+    <w:p>
+      <w:r>
+        <w:rPr>
+          <w:rtl/>
+        </w:rPr>
+        <w:t>בנינו מערכת שבה</w:t>
+      </w:r>
+      <w:r>
+        <w:t>:</w:t>
+      </w:r>
+    </w:p>
+    <w:p>
+      <w:pPr>
+        <w:numPr>
+          <w:ilvl w:val="0"/>
+          <w:numId w:val="8"/>
+        </w:numPr>
+      </w:pPr>
+      <w:r>
+        <w:rPr>
+          <w:rtl/>
+        </w:rPr>
+        <w:t xml:space="preserve">יש </w:t>
+      </w:r>
+      <w:r>
+        <w:rPr>
+          <w:b/>
+          <w:bCs/>
+        </w:rPr>
+        <w:t>Deployment</w:t>
+      </w:r>
+      <w:r>
+        <w:t xml:space="preserve"> </w:t>
+      </w:r>
+      <w:r>
+        <w:rPr>
+          <w:rtl/>
+        </w:rPr>
+        <w:t>שמריץ את האפליקציה שלך</w:t>
+      </w:r>
+    </w:p>
+    <w:p>
+      <w:pPr>
+        <w:numPr>
+          <w:ilvl w:val="0"/>
+          <w:numId w:val="8"/>
+        </w:numPr>
+      </w:pPr>
+      <w:r>
+        <w:rPr>
+          <w:rtl/>
+        </w:rPr>
+        <w:t xml:space="preserve">יש </w:t>
+      </w:r>
+      <w:r>
+        <w:rPr>
+          <w:b/>
+          <w:bCs/>
+        </w:rPr>
+        <w:t>Service</w:t>
+      </w:r>
+      <w:r>
+        <w:t xml:space="preserve"> </w:t>
+      </w:r>
+      <w:r>
+        <w:rPr>
+          <w:rtl/>
+        </w:rPr>
+        <w:t>שמחלק תעבורה בין ה</w:t>
+      </w:r>
+      <w:r>
+        <w:t>-Pods</w:t>
+      </w:r>
+    </w:p>
+    <w:p>
+      <w:pPr>
+        <w:numPr>
+          <w:ilvl w:val="0"/>
+          <w:numId w:val="8"/>
+        </w:numPr>
+      </w:pPr>
+      <w:r>
+        <w:rPr>
+          <w:rtl/>
+        </w:rPr>
+        <w:t xml:space="preserve">יש </w:t>
+      </w:r>
+      <w:r>
+        <w:rPr>
+          <w:b/>
+          <w:bCs/>
+        </w:rPr>
+        <w:t>HPA</w:t>
+      </w:r>
+      <w:r>
+        <w:t xml:space="preserve"> </w:t>
+      </w:r>
+      <w:r>
+        <w:rPr>
+          <w:rtl/>
+        </w:rPr>
+        <w:t>שעוקב אחרי צריכת ה</w:t>
+      </w:r>
+      <w:r>
+        <w:t>-CPU</w:t>
+      </w:r>
+    </w:p>
+    <w:p>
+      <w:pPr>
+        <w:numPr>
+          <w:ilvl w:val="0"/>
+          <w:numId w:val="8"/>
+        </w:numPr>
+      </w:pPr>
+      <w:r>
+        <w:rPr>
+          <w:rtl/>
+        </w:rPr>
+        <w:t xml:space="preserve">יש </w:t>
+      </w:r>
+      <w:r>
+        <w:rPr>
+          <w:b/>
+          <w:bCs/>
+        </w:rPr>
+        <w:t>Metrics Server</w:t>
+      </w:r>
+      <w:r>
+        <w:t xml:space="preserve"> </w:t>
+      </w:r>
+      <w:r>
+        <w:rPr>
+          <w:rtl/>
+        </w:rPr>
+        <w:t>שמודד כמה</w:t>
+      </w:r>
+      <w:r>
+        <w:t xml:space="preserve"> CPU </w:t>
+      </w:r>
+      <w:r>
+        <w:rPr>
+          <w:rtl/>
+        </w:rPr>
+        <w:t>כל</w:t>
+      </w:r>
+      <w:r>
+        <w:t xml:space="preserve"> Pod </w:t>
+      </w:r>
+      <w:r>
+        <w:rPr>
+          <w:rtl/>
+        </w:rPr>
+        <w:t>צורך</w:t>
+      </w:r>
+    </w:p>
+    <w:p>
+      <w:pPr>
+        <w:numPr>
+          <w:ilvl w:val="0"/>
+          <w:numId w:val="8"/>
+        </w:numPr>
+      </w:pPr>
+      <w:r>
+        <w:t xml:space="preserve">Kubernetes </w:t>
+      </w:r>
+      <w:r>
+        <w:rPr>
+          <w:rtl/>
+        </w:rPr>
+        <w:t>מחליט לבד</w:t>
+      </w:r>
+      <w:r>
+        <w:t>:</w:t>
+      </w:r>
+    </w:p>
+    <w:p>
+      <w:pPr>
+        <w:numPr>
+          <w:ilvl w:val="1"/>
+          <w:numId w:val="8"/>
+        </w:numPr>
+      </w:pPr>
+      <w:r>
+        <w:rPr>
+          <w:rtl/>
+        </w:rPr>
+        <w:t>כמה</w:t>
+      </w:r>
+      <w:r>
+        <w:t xml:space="preserve"> Pods </w:t>
+      </w:r>
+      <w:r>
+        <w:rPr>
+          <w:rtl/>
+        </w:rPr>
+        <w:t>צריכים להיות עכשיו</w:t>
+      </w:r>
+    </w:p>
+    <w:p>
+      <w:pPr>
+        <w:rPr>
+          <w:rtl/>
+        </w:rPr>
+      </w:pPr>
+    </w:p>
+    <w:p>
+      <w:pPr>
+        <w:rPr>
+          <w:rtl/>
+        </w:rPr>
+      </w:pPr>
+    </w:p>
+    <w:p>
+      <w:pPr>
+        <w:rPr>
+          <w:rtl/>
+        </w:rPr>
+      </w:pPr>
+    </w:p>
+    <w:p>
+      <w:pPr>
+        <w:rPr>
+          <w:b/>
+          <w:bCs/>
+        </w:rPr>
+      </w:pPr>
+      <w:r>
+        <w:rPr>
+          <w:b/>
+          <w:bCs/>
+          <w:rtl/>
+        </w:rPr>
+        <w:t>מה בעצם עשית כאן? (הסבר פשוט)</w:t>
+      </w:r>
+    </w:p>
+    <w:p>
+      <w:r>
+        <w:rPr>
+          <w:rtl/>
+        </w:rPr>
+        <w:lastRenderedPageBreak/>
+        <w:t>בשלב הזה בנית אפליקציה שרצה על</w:t>
+      </w:r>
+      <w:r>
+        <w:t xml:space="preserve"> Kubernetes </w:t>
+      </w:r>
+      <w:r>
+        <w:rPr>
+          <w:rtl/>
+        </w:rPr>
+        <w:t xml:space="preserve">בצורה </w:t>
+      </w:r>
+      <w:r>
+        <w:rPr>
+          <w:b/>
+          <w:bCs/>
+          <w:rtl/>
+        </w:rPr>
+        <w:t>חכמה, יציבה ואוטומטית</w:t>
+      </w:r>
+      <w:r>
+        <w:t xml:space="preserve">, </w:t>
+      </w:r>
+      <w:r>
+        <w:rPr>
+          <w:rtl/>
+        </w:rPr>
+        <w:t xml:space="preserve">כמו מערכת אמיתית </w:t>
+      </w:r>
+      <w:proofErr w:type="spellStart"/>
+      <w:r>
+        <w:rPr>
+          <w:rtl/>
+        </w:rPr>
+        <w:t>בפרודקשן</w:t>
+      </w:r>
+      <w:proofErr w:type="spellEnd"/>
+      <w:r>
+        <w:t>.</w:t>
+      </w:r>
+    </w:p>
+    <w:p>
+      <w:r>
+        <w:pict w14:anchorId="2BC48701">
+          <v:rect id="_x0000_i1088" style="width:0;height:1.5pt" o:hralign="center" o:hrstd="t" o:hr="t" fillcolor="#a0a0a0" stroked="f"/>
+        </w:pict>
+      </w:r>
+    </w:p>
+    <w:p>
+      <w:pPr>
+        <w:rPr>
+          <w:b/>
+          <w:bCs/>
+        </w:rPr>
+      </w:pPr>
+      <w:r>
+        <w:rPr>
+          <w:b/>
+          <w:bCs/>
+        </w:rPr>
+        <w:t>1️</w:t>
+      </w:r>
+      <w:r>
+        <w:rPr>
+          <w:rFonts w:ascii="Segoe UI Symbol" w:hAnsi="Segoe UI Symbol" w:cs="Segoe UI Symbol"/>
+          <w:b/>
+          <w:bCs/>
+        </w:rPr>
+        <w:t>⃣</w:t>
+      </w:r>
+      <w:r>
+        <w:rPr>
+          <w:b/>
+          <w:bCs/>
+        </w:rPr>
+        <w:t xml:space="preserve"> </w:t>
+      </w:r>
+      <w:r>
+        <w:rPr>
+          <w:b/>
+          <w:bCs/>
+          <w:rtl/>
+        </w:rPr>
+        <w:t>ניתקת את הקוד מהקונפיגורציה</w:t>
+      </w:r>
+      <w:r>
+        <w:rPr>
+          <w:b/>
+          <w:bCs/>
+        </w:rPr>
+        <w:t xml:space="preserve"> (</w:t>
+      </w:r>
+      <w:proofErr w:type="spellStart"/>
+      <w:r>
+        <w:rPr>
+          <w:b/>
+          <w:bCs/>
+        </w:rPr>
+        <w:t>ConfigMap</w:t>
+      </w:r>
+      <w:proofErr w:type="spellEnd"/>
+      <w:r>
+        <w:rPr>
+          <w:b/>
+          <w:bCs/>
+        </w:rPr>
+        <w:t xml:space="preserve"> + Secret)</w:t>
+      </w:r>
+    </w:p>
+    <w:p>
+      <w:pPr>
+        <w:rPr>
+          <w:b/>
+          <w:bCs/>
+        </w:rPr>
+      </w:pPr>
+      <w:r>
+        <w:rPr>
+          <w:b/>
+          <w:bCs/>
+          <w:rtl/>
+        </w:rPr>
+        <w:t>מה היה לפני</w:t>
+      </w:r>
+      <w:r>
+        <w:rPr>
+          <w:b/>
+          <w:bCs/>
+        </w:rPr>
+        <w:t>?</w:t>
+      </w:r>
+    </w:p>
+    <w:p>
+      <w:r>
+        <w:rPr>
+          <w:rtl/>
+        </w:rPr>
+        <w:t>אם היינו שמים ערכים כמו</w:t>
+      </w:r>
+      <w:r>
+        <w:t>:</w:t>
+      </w:r>
+    </w:p>
+    <w:p>
+      <w:pPr>
+        <w:numPr>
+          <w:ilvl w:val="0"/>
+          <w:numId w:val="9"/>
+        </w:numPr>
+      </w:pPr>
+      <w:r>
+        <w:t>ENV</w:t>
+      </w:r>
+    </w:p>
+    <w:p>
+      <w:pPr>
+        <w:numPr>
+          <w:ilvl w:val="0"/>
+          <w:numId w:val="9"/>
+        </w:numPr>
+      </w:pPr>
+      <w:r>
+        <w:rPr>
+          <w:rtl/>
+        </w:rPr>
+        <w:t>סיסמאות</w:t>
+      </w:r>
+    </w:p>
+    <w:p>
+      <w:pPr>
+        <w:numPr>
+          <w:ilvl w:val="0"/>
+          <w:numId w:val="9"/>
+        </w:numPr>
+      </w:pPr>
+      <w:r>
+        <w:rPr>
+          <w:rtl/>
+        </w:rPr>
+        <w:t>מפתחות</w:t>
+      </w:r>
+    </w:p>
+    <w:p>
+      <w:r>
+        <w:rPr>
+          <w:rtl/>
+        </w:rPr>
+        <w:t>ישירות בקוד או ב</w:t>
+      </w:r>
+      <w:r>
+        <w:t xml:space="preserve">-Docker image → </w:t>
+      </w:r>
+      <w:r>
+        <w:rPr>
+          <w:rtl/>
+        </w:rPr>
+        <w:t>כל שינוי היה דורש בנייה מחדש, וזה לא בטוח</w:t>
+      </w:r>
+      <w:r>
+        <w:t>.</w:t>
+      </w:r>
+    </w:p>
+    <w:p>
+      <w:pPr>
+        <w:rPr>
+          <w:b/>
+          <w:bCs/>
+        </w:rPr>
+      </w:pPr>
+      <w:r>
+        <w:rPr>
+          <w:b/>
+          <w:bCs/>
+          <w:rtl/>
+        </w:rPr>
+        <w:t>מה עשית בפועל</w:t>
+      </w:r>
+      <w:r>
+        <w:rPr>
+          <w:b/>
+          <w:bCs/>
+        </w:rPr>
+        <w:t>?</w:t>
+      </w:r>
+    </w:p>
+    <w:p>
+      <w:r>
+        <w:rPr>
+          <w:rtl/>
+        </w:rPr>
+        <w:t>יצרת</w:t>
+      </w:r>
+      <w:r>
+        <w:t>:</w:t>
+      </w:r>
+    </w:p>
+    <w:p>
+      <w:pPr>
+        <w:numPr>
+          <w:ilvl w:val="0"/>
+          <w:numId w:val="10"/>
+        </w:numPr>
+      </w:pPr>
+      <w:proofErr w:type="spellStart"/>
+      <w:r>
+        <w:rPr>
+          <w:b/>
+          <w:bCs/>
+        </w:rPr>
+        <w:t>ConfigMap</w:t>
+      </w:r>
+      <w:proofErr w:type="spellEnd"/>
+      <w:r>
+        <w:t xml:space="preserve"> – </w:t>
+      </w:r>
+      <w:r>
+        <w:rPr>
+          <w:rtl/>
+        </w:rPr>
+        <w:t>לקונפיגורציה רגילה</w:t>
+      </w:r>
+      <w:r>
+        <w:t xml:space="preserve"> (ENV, LOG_LEVEL)</w:t>
+      </w:r>
+    </w:p>
+    <w:p>
+      <w:pPr>
+        <w:numPr>
+          <w:ilvl w:val="0"/>
+          <w:numId w:val="10"/>
+        </w:numPr>
+      </w:pPr>
+      <w:r>
+        <w:rPr>
+          <w:b/>
+          <w:bCs/>
+        </w:rPr>
+        <w:t>Secret</w:t>
+      </w:r>
+      <w:r>
+        <w:t xml:space="preserve"> – </w:t>
+      </w:r>
+      <w:r>
+        <w:rPr>
+          <w:rtl/>
+        </w:rPr>
+        <w:t>למידע רגיש (מפתח סודי)</w:t>
+      </w:r>
+    </w:p>
+    <w:p>
+      <w:r>
+        <w:rPr>
+          <w:rtl/>
+        </w:rPr>
+        <w:t>ואז חיברת אותם ל־</w:t>
+      </w:r>
+      <w:r>
+        <w:t xml:space="preserve">Deployment </w:t>
+      </w:r>
+      <w:r>
+        <w:rPr>
+          <w:rtl/>
+        </w:rPr>
+        <w:t>כ־</w:t>
+      </w:r>
+      <w:r>
+        <w:rPr>
+          <w:b/>
+          <w:bCs/>
+        </w:rPr>
+        <w:t>Environment Variables</w:t>
+      </w:r>
+      <w:r>
+        <w:t>.</w:t>
+      </w:r>
+    </w:p>
+    <w:p>
+      <w:pPr>
+        <w:rPr>
+          <w:b/>
+          <w:bCs/>
+        </w:rPr>
+      </w:pPr>
+      <w:r>
+        <w:rPr>
+          <w:b/>
+          <w:bCs/>
+          <w:rtl/>
+        </w:rPr>
+        <w:t>למה זה חשוב</w:t>
+      </w:r>
+      <w:r>
+        <w:rPr>
+          <w:b/>
+          <w:bCs/>
+        </w:rPr>
+        <w:t>?</w:t>
+      </w:r>
+    </w:p>
+    <w:p>
+      <w:r>
+        <w:rPr>
+          <w:rFonts w:ascii="Segoe UI Symbol" w:hAnsi="Segoe UI Symbol" w:cs="Segoe UI Symbol"/>
+        </w:rPr>
+        <w:t>✔</w:t>
+      </w:r>
+      <w:r>
+        <w:t xml:space="preserve"> </w:t>
+      </w:r>
+      <w:r>
+        <w:rPr>
+          <w:rtl/>
+        </w:rPr>
+        <w:t>שינוי קונפיגורציה בלי לגעת בקוד</w:t>
+      </w:r>
+      <w:r>
+        <w:br/>
+      </w:r>
+      <w:r>
+        <w:rPr>
+          <w:rFonts w:ascii="Segoe UI Symbol" w:hAnsi="Segoe UI Symbol" w:cs="Segoe UI Symbol"/>
+        </w:rPr>
+        <w:t>✔</w:t>
+      </w:r>
+      <w:r>
+        <w:t xml:space="preserve"> </w:t>
+      </w:r>
+      <w:r>
+        <w:rPr>
+          <w:rtl/>
+        </w:rPr>
+        <w:t>אבטחה טובה יותר</w:t>
+      </w:r>
+      <w:r>
+        <w:br/>
+      </w:r>
+      <w:r>
+        <w:rPr>
+          <w:rFonts w:ascii="Segoe UI Symbol" w:hAnsi="Segoe UI Symbol" w:cs="Segoe UI Symbol"/>
+        </w:rPr>
+        <w:t>✔</w:t>
+      </w:r>
+      <w:r>
+        <w:t xml:space="preserve"> </w:t>
+      </w:r>
+      <w:r>
+        <w:rPr>
+          <w:rtl/>
+        </w:rPr>
+        <w:t>אותו</w:t>
+      </w:r>
+      <w:r>
+        <w:t xml:space="preserve"> image </w:t>
+      </w:r>
+      <w:r>
+        <w:rPr>
+          <w:rtl/>
+        </w:rPr>
+        <w:t>יכול לרוץ ב־</w:t>
+      </w:r>
+      <w:r>
+        <w:t>dev / prod</w:t>
+      </w:r>
+    </w:p>
+    <w:p>
+      <w:r>
+        <w:pict w14:anchorId="2D7C080F">
+          <v:rect id="_x0000_i1089" style="width:0;height:1.5pt" o:hralign="center" o:hrstd="t" o:hr="t" fillcolor="#a0a0a0" stroked="f"/>
+        </w:pict>
+      </w:r>
+    </w:p>
+    <w:p>
+      <w:pPr>
+        <w:rPr>
+          <w:b/>
+          <w:bCs/>
+        </w:rPr>
+      </w:pPr>
+      <w:r>
+        <w:rPr>
+          <w:b/>
+          <w:bCs/>
+        </w:rPr>
+        <w:t>2️</w:t>
+      </w:r>
+      <w:r>
+        <w:rPr>
+          <w:rFonts w:ascii="Segoe UI Symbol" w:hAnsi="Segoe UI Symbol" w:cs="Segoe UI Symbol"/>
+          <w:b/>
+          <w:bCs/>
+        </w:rPr>
+        <w:t>⃣</w:t>
+      </w:r>
+      <w:r>
+        <w:rPr>
+          <w:b/>
+          <w:bCs/>
+        </w:rPr>
+        <w:t xml:space="preserve"> </w:t>
+      </w:r>
+      <w:r>
+        <w:rPr>
+          <w:b/>
+          <w:bCs/>
+          <w:rtl/>
+        </w:rPr>
+        <w:t>לימדת את</w:t>
+      </w:r>
+      <w:r>
+        <w:rPr>
+          <w:b/>
+          <w:bCs/>
+        </w:rPr>
+        <w:t xml:space="preserve"> Kubernetes </w:t>
+      </w:r>
+      <w:r>
+        <w:rPr>
+          <w:b/>
+          <w:bCs/>
+          <w:rtl/>
+        </w:rPr>
+        <w:t>לבדוק אם האפליקציה “בריאה</w:t>
+      </w:r>
+      <w:r>
+        <w:rPr>
+          <w:b/>
+          <w:bCs/>
+        </w:rPr>
+        <w:t>” (Probes)</w:t>
+      </w:r>
+    </w:p>
+    <w:p>
+      <w:pPr>
+        <w:rPr>
+          <w:b/>
+          <w:bCs/>
+        </w:rPr>
+      </w:pPr>
+      <w:r>
+        <w:rPr>
+          <w:b/>
+          <w:bCs/>
+          <w:rtl/>
+        </w:rPr>
+        <w:t>הבעיה בלי</w:t>
+      </w:r>
+      <w:r>
+        <w:rPr>
+          <w:b/>
+          <w:bCs/>
+        </w:rPr>
+        <w:t xml:space="preserve"> Probes</w:t>
+      </w:r>
+    </w:p>
+    <w:p>
+      <w:r>
+        <w:t xml:space="preserve">Kubernetes </w:t>
+      </w:r>
+      <w:r>
+        <w:rPr>
+          <w:rtl/>
+        </w:rPr>
+        <w:t>לא באמת יודע</w:t>
+      </w:r>
+      <w:r>
+        <w:t>:</w:t>
+      </w:r>
+    </w:p>
+    <w:p>
+      <w:pPr>
+        <w:numPr>
+          <w:ilvl w:val="0"/>
+          <w:numId w:val="11"/>
+        </w:numPr>
+      </w:pPr>
+      <w:r>
+        <w:rPr>
+          <w:rtl/>
+        </w:rPr>
+        <w:t>אם האפליקציה תקועה</w:t>
+      </w:r>
+    </w:p>
+    <w:p>
+      <w:pPr>
+        <w:numPr>
+          <w:ilvl w:val="0"/>
+          <w:numId w:val="11"/>
+        </w:numPr>
+      </w:pPr>
+      <w:r>
+        <w:rPr>
+          <w:rtl/>
+        </w:rPr>
+        <w:t>אם היא מוכנה לקבל תעבורה</w:t>
+      </w:r>
+    </w:p>
+    <w:p>
+      <w:pPr>
+        <w:rPr>
+          <w:b/>
+          <w:bCs/>
+        </w:rPr>
+      </w:pPr>
+      <w:r>
+        <w:rPr>
+          <w:b/>
+          <w:bCs/>
+          <w:rtl/>
+        </w:rPr>
+        <w:t>מה עשית</w:t>
+      </w:r>
+      <w:r>
+        <w:rPr>
+          <w:b/>
+          <w:bCs/>
+        </w:rPr>
+        <w:t>?</w:t>
+      </w:r>
+    </w:p>
+    <w:p>
+      <w:r>
+        <w:rPr>
+          <w:rtl/>
+        </w:rPr>
+        <w:t>הוספת ל־</w:t>
+      </w:r>
+      <w:r>
+        <w:t>Deployment:</w:t>
+      </w:r>
+    </w:p>
+    <w:p>
+      <w:pPr>
+        <w:numPr>
+          <w:ilvl w:val="0"/>
+          <w:numId w:val="12"/>
+        </w:numPr>
+      </w:pPr>
+      <w:r>
+        <w:rPr>
+          <w:b/>
+          <w:bCs/>
+        </w:rPr>
+        <w:lastRenderedPageBreak/>
+        <w:t>Liveness Probe</w:t>
+      </w:r>
+      <w:r>
+        <w:t xml:space="preserve"> – </w:t>
+      </w:r>
+      <w:r>
+        <w:rPr>
+          <w:rtl/>
+        </w:rPr>
+        <w:t>בודק אם האפליקציה חיה</w:t>
+      </w:r>
+      <w:r>
+        <w:br/>
+      </w:r>
+      <w:r>
+        <w:rPr>
+          <w:rFonts w:ascii="Segoe UI Emoji" w:hAnsi="Segoe UI Emoji" w:cs="Segoe UI Emoji"/>
+        </w:rPr>
+        <w:t>👉</w:t>
+      </w:r>
+      <w:r>
+        <w:t xml:space="preserve"> </w:t>
+      </w:r>
+      <w:r>
+        <w:rPr>
+          <w:rtl/>
+        </w:rPr>
+        <w:t>אם נכשל</w:t>
+      </w:r>
+      <w:r>
+        <w:t xml:space="preserve"> → Kubernetes </w:t>
+      </w:r>
+      <w:r>
+        <w:rPr>
+          <w:rtl/>
+        </w:rPr>
+        <w:t>מפיל ומרים מחדש</w:t>
+      </w:r>
+    </w:p>
+    <w:p>
+      <w:pPr>
+        <w:numPr>
+          <w:ilvl w:val="0"/>
+          <w:numId w:val="12"/>
+        </w:numPr>
+      </w:pPr>
+      <w:r>
+        <w:rPr>
+          <w:b/>
+          <w:bCs/>
+        </w:rPr>
+        <w:t>Readiness Probe</w:t>
+      </w:r>
+      <w:r>
+        <w:t xml:space="preserve"> – </w:t>
+      </w:r>
+      <w:r>
+        <w:rPr>
+          <w:rtl/>
+        </w:rPr>
+        <w:t>בודק אם האפליקציה מוכנה</w:t>
+      </w:r>
+      <w:r>
+        <w:br/>
+      </w:r>
+      <w:r>
+        <w:rPr>
+          <w:rFonts w:ascii="Segoe UI Emoji" w:hAnsi="Segoe UI Emoji" w:cs="Segoe UI Emoji"/>
+        </w:rPr>
+        <w:t>👉</w:t>
+      </w:r>
+      <w:r>
+        <w:t xml:space="preserve"> </w:t>
+      </w:r>
+      <w:r>
+        <w:rPr>
+          <w:rtl/>
+        </w:rPr>
+        <w:t>אם נכשל → לא מקבלת תעבורה, אבל לא נהרגת</w:t>
+      </w:r>
+    </w:p>
+    <w:p>
+      <w:pPr>
+        <w:rPr>
+          <w:b/>
+          <w:bCs/>
+        </w:rPr>
+      </w:pPr>
+      <w:r>
+        <w:rPr>
+          <w:b/>
+          <w:bCs/>
+          <w:rtl/>
+        </w:rPr>
+        <w:t>מה זה נתן לך</w:t>
+      </w:r>
+      <w:r>
+        <w:rPr>
+          <w:b/>
+          <w:bCs/>
+        </w:rPr>
+        <w:t>?</w:t>
+      </w:r>
+    </w:p>
+    <w:p>
+      <w:r>
+        <w:rPr>
+          <w:rFonts w:ascii="Segoe UI Symbol" w:hAnsi="Segoe UI Symbol" w:cs="Segoe UI Symbol"/>
+        </w:rPr>
+        <w:t>✔</w:t>
+      </w:r>
+      <w:r>
+        <w:t xml:space="preserve"> </w:t>
+      </w:r>
+      <w:r>
+        <w:rPr>
+          <w:rtl/>
+        </w:rPr>
+        <w:t xml:space="preserve">אין תעבורה </w:t>
+      </w:r>
+      <w:proofErr w:type="spellStart"/>
+      <w:r>
+        <w:rPr>
+          <w:rtl/>
+        </w:rPr>
+        <w:t>לפוד</w:t>
+      </w:r>
+      <w:proofErr w:type="spellEnd"/>
+      <w:r>
+        <w:rPr>
+          <w:rtl/>
+        </w:rPr>
+        <w:t xml:space="preserve"> שבור</w:t>
+      </w:r>
+      <w:r>
+        <w:br/>
+      </w:r>
+      <w:r>
+        <w:rPr>
+          <w:rFonts w:ascii="Segoe UI Symbol" w:hAnsi="Segoe UI Symbol" w:cs="Segoe UI Symbol"/>
+        </w:rPr>
+        <w:t>✔</w:t>
+      </w:r>
+      <w:r>
+        <w:t xml:space="preserve"> </w:t>
+      </w:r>
+      <w:r>
+        <w:rPr>
+          <w:rtl/>
+        </w:rPr>
+        <w:t xml:space="preserve">אין </w:t>
+      </w:r>
+      <w:proofErr w:type="spellStart"/>
+      <w:r>
+        <w:rPr>
+          <w:rtl/>
+        </w:rPr>
+        <w:t>דאונטיים</w:t>
+      </w:r>
+      <w:proofErr w:type="spellEnd"/>
+      <w:r>
+        <w:rPr>
+          <w:rtl/>
+        </w:rPr>
+        <w:t xml:space="preserve"> בפריסה</w:t>
+      </w:r>
+      <w:r>
+        <w:br/>
+      </w:r>
+      <w:r>
+        <w:rPr>
+          <w:rFonts w:ascii="Segoe UI Symbol" w:hAnsi="Segoe UI Symbol" w:cs="Segoe UI Symbol"/>
+        </w:rPr>
+        <w:t>✔</w:t>
+      </w:r>
+      <w:r>
+        <w:t xml:space="preserve"> </w:t>
+      </w:r>
+      <w:r>
+        <w:rPr>
+          <w:rtl/>
+        </w:rPr>
+        <w:t>מערכת יציבה יותר</w:t>
       </w:r>
     </w:p>
     <w:p>
@@ -2851,6 +5221,1017 @@
 <file path=word/numbering.xml><?xml version="1.0" encoding="utf-8"?>
 <w:numbering xmlns:wpc="http://schemas.microsoft.com/office/word/2010/wordprocessingCanvas" xmlns:cx="http://schemas.microsoft.com/office/drawing/2014/chartex" xmlns:cx1="http://schemas.microsoft.com/office/drawing/2015/9/8/chartex" xmlns:cx2="http://schemas.microsoft.com/office/drawing/2015/10/21/chartex" xmlns:cx3="http://schemas.microsoft.com/office/drawing/2016/5/9/chartex" xmlns:cx4="http://schemas.microsoft.com/office/drawing/2016/5/10/chartex" xmlns:cx5="http://schemas.microsoft.com/office/drawing/2016/5/11/chartex" xmlns:cx6="http://schemas.microsoft.com/office/drawing/2016/5/12/chartex" xmlns:cx7="http://schemas.microsoft.com/office/drawing/2016/5/13/chartex" xmlns:cx8="http://schemas.microsoft.com/office/drawing/2016/5/14/chartex" xmlns:mc="http://schemas.openxmlformats.org/markup-compatibility/2006" xmlns:aink="http://schemas.microsoft.com/office/drawing/2016/ink" xmlns:am3d="http://schemas.microsoft.com/office/drawing/2017/model3d" xmlns:o="urn:schemas-microsoft-com:office:office" xmlns:oel="http://schemas.microsoft.com/office/2019/extlst" xmlns:r="http://schemas.openxmlformats.org/officeDocument/2006/relationships" xmlns:m="http://schemas.openxmlformats.org/officeDocument/2006/math" xmlns:v="urn:schemas-microsoft-com:vml" xmlns:wp14="http://schemas.microsoft.com/office/word/2010/wordprocessingDrawing" xmlns:wp="http://schemas.openxmlformats.org/drawingml/2006/wordprocessingDrawing" xmlns:w10="urn:schemas-microsoft-com:office:word" xmlns:w="http://schemas.openxmlformats.org/wordprocessingml/2006/main" xmlns:w14="http://schemas.microsoft.com/office/word/2010/wordml" xmlns:w15="http://schemas.microsoft.com/office/word/2012/wordml" xmlns:w16cex="http://schemas.microsoft.com/office/word/2018/wordml/cex" xmlns:w16cid="http://schemas.microsoft.com/office/word/2016/wordml/cid" xmlns:w16="http://schemas.microsoft.com/office/word/2018/wordml" xmlns:w16du="http://schemas.microsoft.com/office/word/2023/wordml/word16du" xmlns:w16sdtdh="http://schemas.microsoft.com/office/word/2020/wordml/sdtdatahash" xmlns:w16sdtfl="http://schemas.microsoft.com/office/word/2024/wordml/sdtformatlock" xmlns:w16se="http://schemas.microsoft.com/office/word/2015/wordml/symex" xmlns:wpg="http://schemas.microsoft.com/office/word/2010/wordprocessingGroup" xmlns:wpi="http://schemas.microsoft.com/office/word/2010/wordprocessingInk" xmlns:wne="http://schemas.microsoft.com/office/word/2006/wordml" xmlns:wps="http://schemas.microsoft.com/office/word/2010/wordprocessingShape" mc:Ignorable="w14 w15 w16se w16cid w16 w16cex w16sdtdh w16sdtfl w16du wp14">
   <w:abstractNum w:abstractNumId="0" w15:restartNumberingAfterBreak="0">
+    <w:nsid w:val="03F2192A"/>
+    <w:multiLevelType w:val="multilevel"/>
+    <w:tmpl w:val="1DAA6256"/>
+    <w:lvl w:ilvl="0">
+      <w:start w:val="1"/>
+      <w:numFmt w:val="bullet"/>
+      <w:lvlText w:val=""/>
+      <w:lvlJc w:val="left"/>
+      <w:pPr>
+        <w:tabs>
+          <w:tab w:val="num" w:pos="720"/>
+        </w:tabs>
+        <w:ind w:left="720" w:hanging="360"/>
+      </w:pPr>
+      <w:rPr>
+        <w:rFonts w:ascii="Symbol" w:hAnsi="Symbol" w:hint="default"/>
+        <w:sz w:val="20"/>
+      </w:rPr>
+    </w:lvl>
+    <w:lvl w:ilvl="1" w:tentative="1">
+      <w:start w:val="1"/>
+      <w:numFmt w:val="bullet"/>
+      <w:lvlText w:val="o"/>
+      <w:lvlJc w:val="left"/>
+      <w:pPr>
+        <w:tabs>
+          <w:tab w:val="num" w:pos="1440"/>
+        </w:tabs>
+        <w:ind w:left="1440" w:hanging="360"/>
+      </w:pPr>
+      <w:rPr>
+        <w:rFonts w:ascii="Courier New" w:hAnsi="Courier New" w:hint="default"/>
+        <w:sz w:val="20"/>
+      </w:rPr>
+    </w:lvl>
+    <w:lvl w:ilvl="2" w:tentative="1">
+      <w:start w:val="1"/>
+      <w:numFmt w:val="bullet"/>
+      <w:lvlText w:val=""/>
+      <w:lvlJc w:val="left"/>
+      <w:pPr>
+        <w:tabs>
+          <w:tab w:val="num" w:pos="2160"/>
+        </w:tabs>
+        <w:ind w:left="2160" w:hanging="360"/>
+      </w:pPr>
+      <w:rPr>
+        <w:rFonts w:ascii="Wingdings" w:hAnsi="Wingdings" w:hint="default"/>
+        <w:sz w:val="20"/>
+      </w:rPr>
+    </w:lvl>
+    <w:lvl w:ilvl="3" w:tentative="1">
+      <w:start w:val="1"/>
+      <w:numFmt w:val="bullet"/>
+      <w:lvlText w:val=""/>
+      <w:lvlJc w:val="left"/>
+      <w:pPr>
+        <w:tabs>
+          <w:tab w:val="num" w:pos="2880"/>
+        </w:tabs>
+        <w:ind w:left="2880" w:hanging="360"/>
+      </w:pPr>
+      <w:rPr>
+        <w:rFonts w:ascii="Wingdings" w:hAnsi="Wingdings" w:hint="default"/>
+        <w:sz w:val="20"/>
+      </w:rPr>
+    </w:lvl>
+    <w:lvl w:ilvl="4" w:tentative="1">
+      <w:start w:val="1"/>
+      <w:numFmt w:val="bullet"/>
+      <w:lvlText w:val=""/>
+      <w:lvlJc w:val="left"/>
+      <w:pPr>
+        <w:tabs>
+          <w:tab w:val="num" w:pos="3600"/>
+        </w:tabs>
+        <w:ind w:left="3600" w:hanging="360"/>
+      </w:pPr>
+      <w:rPr>
+        <w:rFonts w:ascii="Wingdings" w:hAnsi="Wingdings" w:hint="default"/>
+        <w:sz w:val="20"/>
+      </w:rPr>
+    </w:lvl>
+    <w:lvl w:ilvl="5" w:tentative="1">
+      <w:start w:val="1"/>
+      <w:numFmt w:val="bullet"/>
+      <w:lvlText w:val=""/>
+      <w:lvlJc w:val="left"/>
+      <w:pPr>
+        <w:tabs>
+          <w:tab w:val="num" w:pos="4320"/>
+        </w:tabs>
+        <w:ind w:left="4320" w:hanging="360"/>
+      </w:pPr>
+      <w:rPr>
+        <w:rFonts w:ascii="Wingdings" w:hAnsi="Wingdings" w:hint="default"/>
+        <w:sz w:val="20"/>
+      </w:rPr>
+    </w:lvl>
+    <w:lvl w:ilvl="6" w:tentative="1">
+      <w:start w:val="1"/>
+      <w:numFmt w:val="bullet"/>
+      <w:lvlText w:val=""/>
+      <w:lvlJc w:val="left"/>
+      <w:pPr>
+        <w:tabs>
+          <w:tab w:val="num" w:pos="5040"/>
+        </w:tabs>
+        <w:ind w:left="5040" w:hanging="360"/>
+      </w:pPr>
+      <w:rPr>
+        <w:rFonts w:ascii="Wingdings" w:hAnsi="Wingdings" w:hint="default"/>
+        <w:sz w:val="20"/>
+      </w:rPr>
+    </w:lvl>
+    <w:lvl w:ilvl="7" w:tentative="1">
+      <w:start w:val="1"/>
+      <w:numFmt w:val="bullet"/>
+      <w:lvlText w:val=""/>
+      <w:lvlJc w:val="left"/>
+      <w:pPr>
+        <w:tabs>
+          <w:tab w:val="num" w:pos="5760"/>
+        </w:tabs>
+        <w:ind w:left="5760" w:hanging="360"/>
+      </w:pPr>
+      <w:rPr>
+        <w:rFonts w:ascii="Wingdings" w:hAnsi="Wingdings" w:hint="default"/>
+        <w:sz w:val="20"/>
+      </w:rPr>
+    </w:lvl>
+    <w:lvl w:ilvl="8" w:tentative="1">
+      <w:start w:val="1"/>
+      <w:numFmt w:val="bullet"/>
+      <w:lvlText w:val=""/>
+      <w:lvlJc w:val="left"/>
+      <w:pPr>
+        <w:tabs>
+          <w:tab w:val="num" w:pos="6480"/>
+        </w:tabs>
+        <w:ind w:left="6480" w:hanging="360"/>
+      </w:pPr>
+      <w:rPr>
+        <w:rFonts w:ascii="Wingdings" w:hAnsi="Wingdings" w:hint="default"/>
+        <w:sz w:val="20"/>
+      </w:rPr>
+    </w:lvl>
+  </w:abstractNum>
+  <w:abstractNum w:abstractNumId="1" w15:restartNumberingAfterBreak="0">
+    <w:nsid w:val="05EC6043"/>
+    <w:multiLevelType w:val="multilevel"/>
+    <w:tmpl w:val="853233D4"/>
+    <w:lvl w:ilvl="0">
+      <w:start w:val="1"/>
+      <w:numFmt w:val="bullet"/>
+      <w:lvlText w:val=""/>
+      <w:lvlJc w:val="left"/>
+      <w:pPr>
+        <w:tabs>
+          <w:tab w:val="num" w:pos="720"/>
+        </w:tabs>
+        <w:ind w:left="720" w:hanging="360"/>
+      </w:pPr>
+      <w:rPr>
+        <w:rFonts w:ascii="Symbol" w:hAnsi="Symbol" w:hint="default"/>
+        <w:sz w:val="20"/>
+      </w:rPr>
+    </w:lvl>
+    <w:lvl w:ilvl="1" w:tentative="1">
+      <w:start w:val="1"/>
+      <w:numFmt w:val="bullet"/>
+      <w:lvlText w:val="o"/>
+      <w:lvlJc w:val="left"/>
+      <w:pPr>
+        <w:tabs>
+          <w:tab w:val="num" w:pos="1440"/>
+        </w:tabs>
+        <w:ind w:left="1440" w:hanging="360"/>
+      </w:pPr>
+      <w:rPr>
+        <w:rFonts w:ascii="Courier New" w:hAnsi="Courier New" w:hint="default"/>
+        <w:sz w:val="20"/>
+      </w:rPr>
+    </w:lvl>
+    <w:lvl w:ilvl="2" w:tentative="1">
+      <w:start w:val="1"/>
+      <w:numFmt w:val="bullet"/>
+      <w:lvlText w:val=""/>
+      <w:lvlJc w:val="left"/>
+      <w:pPr>
+        <w:tabs>
+          <w:tab w:val="num" w:pos="2160"/>
+        </w:tabs>
+        <w:ind w:left="2160" w:hanging="360"/>
+      </w:pPr>
+      <w:rPr>
+        <w:rFonts w:ascii="Wingdings" w:hAnsi="Wingdings" w:hint="default"/>
+        <w:sz w:val="20"/>
+      </w:rPr>
+    </w:lvl>
+    <w:lvl w:ilvl="3" w:tentative="1">
+      <w:start w:val="1"/>
+      <w:numFmt w:val="bullet"/>
+      <w:lvlText w:val=""/>
+      <w:lvlJc w:val="left"/>
+      <w:pPr>
+        <w:tabs>
+          <w:tab w:val="num" w:pos="2880"/>
+        </w:tabs>
+        <w:ind w:left="2880" w:hanging="360"/>
+      </w:pPr>
+      <w:rPr>
+        <w:rFonts w:ascii="Wingdings" w:hAnsi="Wingdings" w:hint="default"/>
+        <w:sz w:val="20"/>
+      </w:rPr>
+    </w:lvl>
+    <w:lvl w:ilvl="4" w:tentative="1">
+      <w:start w:val="1"/>
+      <w:numFmt w:val="bullet"/>
+      <w:lvlText w:val=""/>
+      <w:lvlJc w:val="left"/>
+      <w:pPr>
+        <w:tabs>
+          <w:tab w:val="num" w:pos="3600"/>
+        </w:tabs>
+        <w:ind w:left="3600" w:hanging="360"/>
+      </w:pPr>
+      <w:rPr>
+        <w:rFonts w:ascii="Wingdings" w:hAnsi="Wingdings" w:hint="default"/>
+        <w:sz w:val="20"/>
+      </w:rPr>
+    </w:lvl>
+    <w:lvl w:ilvl="5" w:tentative="1">
+      <w:start w:val="1"/>
+      <w:numFmt w:val="bullet"/>
+      <w:lvlText w:val=""/>
+      <w:lvlJc w:val="left"/>
+      <w:pPr>
+        <w:tabs>
+          <w:tab w:val="num" w:pos="4320"/>
+        </w:tabs>
+        <w:ind w:left="4320" w:hanging="360"/>
+      </w:pPr>
+      <w:rPr>
+        <w:rFonts w:ascii="Wingdings" w:hAnsi="Wingdings" w:hint="default"/>
+        <w:sz w:val="20"/>
+      </w:rPr>
+    </w:lvl>
+    <w:lvl w:ilvl="6" w:tentative="1">
+      <w:start w:val="1"/>
+      <w:numFmt w:val="bullet"/>
+      <w:lvlText w:val=""/>
+      <w:lvlJc w:val="left"/>
+      <w:pPr>
+        <w:tabs>
+          <w:tab w:val="num" w:pos="5040"/>
+        </w:tabs>
+        <w:ind w:left="5040" w:hanging="360"/>
+      </w:pPr>
+      <w:rPr>
+        <w:rFonts w:ascii="Wingdings" w:hAnsi="Wingdings" w:hint="default"/>
+        <w:sz w:val="20"/>
+      </w:rPr>
+    </w:lvl>
+    <w:lvl w:ilvl="7" w:tentative="1">
+      <w:start w:val="1"/>
+      <w:numFmt w:val="bullet"/>
+      <w:lvlText w:val=""/>
+      <w:lvlJc w:val="left"/>
+      <w:pPr>
+        <w:tabs>
+          <w:tab w:val="num" w:pos="5760"/>
+        </w:tabs>
+        <w:ind w:left="5760" w:hanging="360"/>
+      </w:pPr>
+      <w:rPr>
+        <w:rFonts w:ascii="Wingdings" w:hAnsi="Wingdings" w:hint="default"/>
+        <w:sz w:val="20"/>
+      </w:rPr>
+    </w:lvl>
+    <w:lvl w:ilvl="8" w:tentative="1">
+      <w:start w:val="1"/>
+      <w:numFmt w:val="bullet"/>
+      <w:lvlText w:val=""/>
+      <w:lvlJc w:val="left"/>
+      <w:pPr>
+        <w:tabs>
+          <w:tab w:val="num" w:pos="6480"/>
+        </w:tabs>
+        <w:ind w:left="6480" w:hanging="360"/>
+      </w:pPr>
+      <w:rPr>
+        <w:rFonts w:ascii="Wingdings" w:hAnsi="Wingdings" w:hint="default"/>
+        <w:sz w:val="20"/>
+      </w:rPr>
+    </w:lvl>
+  </w:abstractNum>
+  <w:abstractNum w:abstractNumId="2" w15:restartNumberingAfterBreak="0">
+    <w:nsid w:val="0BE51156"/>
+    <w:multiLevelType w:val="multilevel"/>
+    <w:tmpl w:val="A568F14E"/>
+    <w:lvl w:ilvl="0">
+      <w:start w:val="1"/>
+      <w:numFmt w:val="bullet"/>
+      <w:lvlText w:val=""/>
+      <w:lvlJc w:val="left"/>
+      <w:pPr>
+        <w:tabs>
+          <w:tab w:val="num" w:pos="720"/>
+        </w:tabs>
+        <w:ind w:left="720" w:hanging="360"/>
+      </w:pPr>
+      <w:rPr>
+        <w:rFonts w:ascii="Symbol" w:hAnsi="Symbol" w:hint="default"/>
+        <w:sz w:val="20"/>
+      </w:rPr>
+    </w:lvl>
+    <w:lvl w:ilvl="1" w:tentative="1">
+      <w:start w:val="1"/>
+      <w:numFmt w:val="bullet"/>
+      <w:lvlText w:val="o"/>
+      <w:lvlJc w:val="left"/>
+      <w:pPr>
+        <w:tabs>
+          <w:tab w:val="num" w:pos="1440"/>
+        </w:tabs>
+        <w:ind w:left="1440" w:hanging="360"/>
+      </w:pPr>
+      <w:rPr>
+        <w:rFonts w:ascii="Courier New" w:hAnsi="Courier New" w:hint="default"/>
+        <w:sz w:val="20"/>
+      </w:rPr>
+    </w:lvl>
+    <w:lvl w:ilvl="2" w:tentative="1">
+      <w:start w:val="1"/>
+      <w:numFmt w:val="bullet"/>
+      <w:lvlText w:val=""/>
+      <w:lvlJc w:val="left"/>
+      <w:pPr>
+        <w:tabs>
+          <w:tab w:val="num" w:pos="2160"/>
+        </w:tabs>
+        <w:ind w:left="2160" w:hanging="360"/>
+      </w:pPr>
+      <w:rPr>
+        <w:rFonts w:ascii="Wingdings" w:hAnsi="Wingdings" w:hint="default"/>
+        <w:sz w:val="20"/>
+      </w:rPr>
+    </w:lvl>
+    <w:lvl w:ilvl="3" w:tentative="1">
+      <w:start w:val="1"/>
+      <w:numFmt w:val="bullet"/>
+      <w:lvlText w:val=""/>
+      <w:lvlJc w:val="left"/>
+      <w:pPr>
+        <w:tabs>
+          <w:tab w:val="num" w:pos="2880"/>
+        </w:tabs>
+        <w:ind w:left="2880" w:hanging="360"/>
+      </w:pPr>
+      <w:rPr>
+        <w:rFonts w:ascii="Wingdings" w:hAnsi="Wingdings" w:hint="default"/>
+        <w:sz w:val="20"/>
+      </w:rPr>
+    </w:lvl>
+    <w:lvl w:ilvl="4" w:tentative="1">
+      <w:start w:val="1"/>
+      <w:numFmt w:val="bullet"/>
+      <w:lvlText w:val=""/>
+      <w:lvlJc w:val="left"/>
+      <w:pPr>
+        <w:tabs>
+          <w:tab w:val="num" w:pos="3600"/>
+        </w:tabs>
+        <w:ind w:left="3600" w:hanging="360"/>
+      </w:pPr>
+      <w:rPr>
+        <w:rFonts w:ascii="Wingdings" w:hAnsi="Wingdings" w:hint="default"/>
+        <w:sz w:val="20"/>
+      </w:rPr>
+    </w:lvl>
+    <w:lvl w:ilvl="5" w:tentative="1">
+      <w:start w:val="1"/>
+      <w:numFmt w:val="bullet"/>
+      <w:lvlText w:val=""/>
+      <w:lvlJc w:val="left"/>
+      <w:pPr>
+        <w:tabs>
+          <w:tab w:val="num" w:pos="4320"/>
+        </w:tabs>
+        <w:ind w:left="4320" w:hanging="360"/>
+      </w:pPr>
+      <w:rPr>
+        <w:rFonts w:ascii="Wingdings" w:hAnsi="Wingdings" w:hint="default"/>
+        <w:sz w:val="20"/>
+      </w:rPr>
+    </w:lvl>
+    <w:lvl w:ilvl="6" w:tentative="1">
+      <w:start w:val="1"/>
+      <w:numFmt w:val="bullet"/>
+      <w:lvlText w:val=""/>
+      <w:lvlJc w:val="left"/>
+      <w:pPr>
+        <w:tabs>
+          <w:tab w:val="num" w:pos="5040"/>
+        </w:tabs>
+        <w:ind w:left="5040" w:hanging="360"/>
+      </w:pPr>
+      <w:rPr>
+        <w:rFonts w:ascii="Wingdings" w:hAnsi="Wingdings" w:hint="default"/>
+        <w:sz w:val="20"/>
+      </w:rPr>
+    </w:lvl>
+    <w:lvl w:ilvl="7" w:tentative="1">
+      <w:start w:val="1"/>
+      <w:numFmt w:val="bullet"/>
+      <w:lvlText w:val=""/>
+      <w:lvlJc w:val="left"/>
+      <w:pPr>
+        <w:tabs>
+          <w:tab w:val="num" w:pos="5760"/>
+        </w:tabs>
+        <w:ind w:left="5760" w:hanging="360"/>
+      </w:pPr>
+      <w:rPr>
+        <w:rFonts w:ascii="Wingdings" w:hAnsi="Wingdings" w:hint="default"/>
+        <w:sz w:val="20"/>
+      </w:rPr>
+    </w:lvl>
+    <w:lvl w:ilvl="8" w:tentative="1">
+      <w:start w:val="1"/>
+      <w:numFmt w:val="bullet"/>
+      <w:lvlText w:val=""/>
+      <w:lvlJc w:val="left"/>
+      <w:pPr>
+        <w:tabs>
+          <w:tab w:val="num" w:pos="6480"/>
+        </w:tabs>
+        <w:ind w:left="6480" w:hanging="360"/>
+      </w:pPr>
+      <w:rPr>
+        <w:rFonts w:ascii="Wingdings" w:hAnsi="Wingdings" w:hint="default"/>
+        <w:sz w:val="20"/>
+      </w:rPr>
+    </w:lvl>
+  </w:abstractNum>
+  <w:abstractNum w:abstractNumId="3" w15:restartNumberingAfterBreak="0">
+    <w:nsid w:val="0FC1078B"/>
+    <w:multiLevelType w:val="multilevel"/>
+    <w:tmpl w:val="09E01E9C"/>
+    <w:lvl w:ilvl="0">
+      <w:start w:val="1"/>
+      <w:numFmt w:val="decimal"/>
+      <w:lvlText w:val="%1."/>
+      <w:lvlJc w:val="left"/>
+      <w:pPr>
+        <w:tabs>
+          <w:tab w:val="num" w:pos="720"/>
+        </w:tabs>
+        <w:ind w:left="720" w:hanging="360"/>
+      </w:pPr>
+    </w:lvl>
+    <w:lvl w:ilvl="1">
+      <w:start w:val="1"/>
+      <w:numFmt w:val="bullet"/>
+      <w:lvlText w:val="o"/>
+      <w:lvlJc w:val="left"/>
+      <w:pPr>
+        <w:tabs>
+          <w:tab w:val="num" w:pos="1440"/>
+        </w:tabs>
+        <w:ind w:left="1440" w:hanging="360"/>
+      </w:pPr>
+      <w:rPr>
+        <w:rFonts w:ascii="Courier New" w:hAnsi="Courier New" w:hint="default"/>
+        <w:sz w:val="20"/>
+      </w:rPr>
+    </w:lvl>
+    <w:lvl w:ilvl="2" w:tentative="1">
+      <w:start w:val="1"/>
+      <w:numFmt w:val="decimal"/>
+      <w:lvlText w:val="%3."/>
+      <w:lvlJc w:val="left"/>
+      <w:pPr>
+        <w:tabs>
+          <w:tab w:val="num" w:pos="2160"/>
+        </w:tabs>
+        <w:ind w:left="2160" w:hanging="360"/>
+      </w:pPr>
+    </w:lvl>
+    <w:lvl w:ilvl="3" w:tentative="1">
+      <w:start w:val="1"/>
+      <w:numFmt w:val="decimal"/>
+      <w:lvlText w:val="%4."/>
+      <w:lvlJc w:val="left"/>
+      <w:pPr>
+        <w:tabs>
+          <w:tab w:val="num" w:pos="2880"/>
+        </w:tabs>
+        <w:ind w:left="2880" w:hanging="360"/>
+      </w:pPr>
+    </w:lvl>
+    <w:lvl w:ilvl="4" w:tentative="1">
+      <w:start w:val="1"/>
+      <w:numFmt w:val="decimal"/>
+      <w:lvlText w:val="%5."/>
+      <w:lvlJc w:val="left"/>
+      <w:pPr>
+        <w:tabs>
+          <w:tab w:val="num" w:pos="3600"/>
+        </w:tabs>
+        <w:ind w:left="3600" w:hanging="360"/>
+      </w:pPr>
+    </w:lvl>
+    <w:lvl w:ilvl="5" w:tentative="1">
+      <w:start w:val="1"/>
+      <w:numFmt w:val="decimal"/>
+      <w:lvlText w:val="%6."/>
+      <w:lvlJc w:val="left"/>
+      <w:pPr>
+        <w:tabs>
+          <w:tab w:val="num" w:pos="4320"/>
+        </w:tabs>
+        <w:ind w:left="4320" w:hanging="360"/>
+      </w:pPr>
+    </w:lvl>
+    <w:lvl w:ilvl="6" w:tentative="1">
+      <w:start w:val="1"/>
+      <w:numFmt w:val="decimal"/>
+      <w:lvlText w:val="%7."/>
+      <w:lvlJc w:val="left"/>
+      <w:pPr>
+        <w:tabs>
+          <w:tab w:val="num" w:pos="5040"/>
+        </w:tabs>
+        <w:ind w:left="5040" w:hanging="360"/>
+      </w:pPr>
+    </w:lvl>
+    <w:lvl w:ilvl="7" w:tentative="1">
+      <w:start w:val="1"/>
+      <w:numFmt w:val="decimal"/>
+      <w:lvlText w:val="%8."/>
+      <w:lvlJc w:val="left"/>
+      <w:pPr>
+        <w:tabs>
+          <w:tab w:val="num" w:pos="5760"/>
+        </w:tabs>
+        <w:ind w:left="5760" w:hanging="360"/>
+      </w:pPr>
+    </w:lvl>
+    <w:lvl w:ilvl="8" w:tentative="1">
+      <w:start w:val="1"/>
+      <w:numFmt w:val="decimal"/>
+      <w:lvlText w:val="%9."/>
+      <w:lvlJc w:val="left"/>
+      <w:pPr>
+        <w:tabs>
+          <w:tab w:val="num" w:pos="6480"/>
+        </w:tabs>
+        <w:ind w:left="6480" w:hanging="360"/>
+      </w:pPr>
+    </w:lvl>
+  </w:abstractNum>
+  <w:abstractNum w:abstractNumId="4" w15:restartNumberingAfterBreak="0">
+    <w:nsid w:val="1C7E4CF0"/>
+    <w:multiLevelType w:val="multilevel"/>
+    <w:tmpl w:val="A8846BBE"/>
+    <w:lvl w:ilvl="0">
+      <w:start w:val="1"/>
+      <w:numFmt w:val="bullet"/>
+      <w:lvlText w:val=""/>
+      <w:lvlJc w:val="left"/>
+      <w:pPr>
+        <w:tabs>
+          <w:tab w:val="num" w:pos="720"/>
+        </w:tabs>
+        <w:ind w:left="720" w:hanging="360"/>
+      </w:pPr>
+      <w:rPr>
+        <w:rFonts w:ascii="Symbol" w:hAnsi="Symbol" w:hint="default"/>
+        <w:sz w:val="20"/>
+      </w:rPr>
+    </w:lvl>
+    <w:lvl w:ilvl="1" w:tentative="1">
+      <w:start w:val="1"/>
+      <w:numFmt w:val="bullet"/>
+      <w:lvlText w:val="o"/>
+      <w:lvlJc w:val="left"/>
+      <w:pPr>
+        <w:tabs>
+          <w:tab w:val="num" w:pos="1440"/>
+        </w:tabs>
+        <w:ind w:left="1440" w:hanging="360"/>
+      </w:pPr>
+      <w:rPr>
+        <w:rFonts w:ascii="Courier New" w:hAnsi="Courier New" w:hint="default"/>
+        <w:sz w:val="20"/>
+      </w:rPr>
+    </w:lvl>
+    <w:lvl w:ilvl="2" w:tentative="1">
+      <w:start w:val="1"/>
+      <w:numFmt w:val="bullet"/>
+      <w:lvlText w:val=""/>
+      <w:lvlJc w:val="left"/>
+      <w:pPr>
+        <w:tabs>
+          <w:tab w:val="num" w:pos="2160"/>
+        </w:tabs>
+        <w:ind w:left="2160" w:hanging="360"/>
+      </w:pPr>
+      <w:rPr>
+        <w:rFonts w:ascii="Wingdings" w:hAnsi="Wingdings" w:hint="default"/>
+        <w:sz w:val="20"/>
+      </w:rPr>
+    </w:lvl>
+    <w:lvl w:ilvl="3" w:tentative="1">
+      <w:start w:val="1"/>
+      <w:numFmt w:val="bullet"/>
+      <w:lvlText w:val=""/>
+      <w:lvlJc w:val="left"/>
+      <w:pPr>
+        <w:tabs>
+          <w:tab w:val="num" w:pos="2880"/>
+        </w:tabs>
+        <w:ind w:left="2880" w:hanging="360"/>
+      </w:pPr>
+      <w:rPr>
+        <w:rFonts w:ascii="Wingdings" w:hAnsi="Wingdings" w:hint="default"/>
+        <w:sz w:val="20"/>
+      </w:rPr>
+    </w:lvl>
+    <w:lvl w:ilvl="4" w:tentative="1">
+      <w:start w:val="1"/>
+      <w:numFmt w:val="bullet"/>
+      <w:lvlText w:val=""/>
+      <w:lvlJc w:val="left"/>
+      <w:pPr>
+        <w:tabs>
+          <w:tab w:val="num" w:pos="3600"/>
+        </w:tabs>
+        <w:ind w:left="3600" w:hanging="360"/>
+      </w:pPr>
+      <w:rPr>
+        <w:rFonts w:ascii="Wingdings" w:hAnsi="Wingdings" w:hint="default"/>
+        <w:sz w:val="20"/>
+      </w:rPr>
+    </w:lvl>
+    <w:lvl w:ilvl="5" w:tentative="1">
+      <w:start w:val="1"/>
+      <w:numFmt w:val="bullet"/>
+      <w:lvlText w:val=""/>
+      <w:lvlJc w:val="left"/>
+      <w:pPr>
+        <w:tabs>
+          <w:tab w:val="num" w:pos="4320"/>
+        </w:tabs>
+        <w:ind w:left="4320" w:hanging="360"/>
+      </w:pPr>
+      <w:rPr>
+        <w:rFonts w:ascii="Wingdings" w:hAnsi="Wingdings" w:hint="default"/>
+        <w:sz w:val="20"/>
+      </w:rPr>
+    </w:lvl>
+    <w:lvl w:ilvl="6" w:tentative="1">
+      <w:start w:val="1"/>
+      <w:numFmt w:val="bullet"/>
+      <w:lvlText w:val=""/>
+      <w:lvlJc w:val="left"/>
+      <w:pPr>
+        <w:tabs>
+          <w:tab w:val="num" w:pos="5040"/>
+        </w:tabs>
+        <w:ind w:left="5040" w:hanging="360"/>
+      </w:pPr>
+      <w:rPr>
+        <w:rFonts w:ascii="Wingdings" w:hAnsi="Wingdings" w:hint="default"/>
+        <w:sz w:val="20"/>
+      </w:rPr>
+    </w:lvl>
+    <w:lvl w:ilvl="7" w:tentative="1">
+      <w:start w:val="1"/>
+      <w:numFmt w:val="bullet"/>
+      <w:lvlText w:val=""/>
+      <w:lvlJc w:val="left"/>
+      <w:pPr>
+        <w:tabs>
+          <w:tab w:val="num" w:pos="5760"/>
+        </w:tabs>
+        <w:ind w:left="5760" w:hanging="360"/>
+      </w:pPr>
+      <w:rPr>
+        <w:rFonts w:ascii="Wingdings" w:hAnsi="Wingdings" w:hint="default"/>
+        <w:sz w:val="20"/>
+      </w:rPr>
+    </w:lvl>
+    <w:lvl w:ilvl="8" w:tentative="1">
+      <w:start w:val="1"/>
+      <w:numFmt w:val="bullet"/>
+      <w:lvlText w:val=""/>
+      <w:lvlJc w:val="left"/>
+      <w:pPr>
+        <w:tabs>
+          <w:tab w:val="num" w:pos="6480"/>
+        </w:tabs>
+        <w:ind w:left="6480" w:hanging="360"/>
+      </w:pPr>
+      <w:rPr>
+        <w:rFonts w:ascii="Wingdings" w:hAnsi="Wingdings" w:hint="default"/>
+        <w:sz w:val="20"/>
+      </w:rPr>
+    </w:lvl>
+  </w:abstractNum>
+  <w:abstractNum w:abstractNumId="5" w15:restartNumberingAfterBreak="0">
+    <w:nsid w:val="225D77E9"/>
+    <w:multiLevelType w:val="multilevel"/>
+    <w:tmpl w:val="F1945E7C"/>
+    <w:lvl w:ilvl="0">
+      <w:start w:val="1"/>
+      <w:numFmt w:val="bullet"/>
+      <w:lvlText w:val=""/>
+      <w:lvlJc w:val="left"/>
+      <w:pPr>
+        <w:tabs>
+          <w:tab w:val="num" w:pos="720"/>
+        </w:tabs>
+        <w:ind w:left="720" w:hanging="360"/>
+      </w:pPr>
+      <w:rPr>
+        <w:rFonts w:ascii="Symbol" w:hAnsi="Symbol" w:hint="default"/>
+        <w:sz w:val="20"/>
+      </w:rPr>
+    </w:lvl>
+    <w:lvl w:ilvl="1" w:tentative="1">
+      <w:start w:val="1"/>
+      <w:numFmt w:val="bullet"/>
+      <w:lvlText w:val="o"/>
+      <w:lvlJc w:val="left"/>
+      <w:pPr>
+        <w:tabs>
+          <w:tab w:val="num" w:pos="1440"/>
+        </w:tabs>
+        <w:ind w:left="1440" w:hanging="360"/>
+      </w:pPr>
+      <w:rPr>
+        <w:rFonts w:ascii="Courier New" w:hAnsi="Courier New" w:hint="default"/>
+        <w:sz w:val="20"/>
+      </w:rPr>
+    </w:lvl>
+    <w:lvl w:ilvl="2" w:tentative="1">
+      <w:start w:val="1"/>
+      <w:numFmt w:val="bullet"/>
+      <w:lvlText w:val=""/>
+      <w:lvlJc w:val="left"/>
+      <w:pPr>
+        <w:tabs>
+          <w:tab w:val="num" w:pos="2160"/>
+        </w:tabs>
+        <w:ind w:left="2160" w:hanging="360"/>
+      </w:pPr>
+      <w:rPr>
+        <w:rFonts w:ascii="Wingdings" w:hAnsi="Wingdings" w:hint="default"/>
+        <w:sz w:val="20"/>
+      </w:rPr>
+    </w:lvl>
+    <w:lvl w:ilvl="3" w:tentative="1">
+      <w:start w:val="1"/>
+      <w:numFmt w:val="bullet"/>
+      <w:lvlText w:val=""/>
+      <w:lvlJc w:val="left"/>
+      <w:pPr>
+        <w:tabs>
+          <w:tab w:val="num" w:pos="2880"/>
+        </w:tabs>
+        <w:ind w:left="2880" w:hanging="360"/>
+      </w:pPr>
+      <w:rPr>
+        <w:rFonts w:ascii="Wingdings" w:hAnsi="Wingdings" w:hint="default"/>
+        <w:sz w:val="20"/>
+      </w:rPr>
+    </w:lvl>
+    <w:lvl w:ilvl="4" w:tentative="1">
+      <w:start w:val="1"/>
+      <w:numFmt w:val="bullet"/>
+      <w:lvlText w:val=""/>
+      <w:lvlJc w:val="left"/>
+      <w:pPr>
+        <w:tabs>
+          <w:tab w:val="num" w:pos="3600"/>
+        </w:tabs>
+        <w:ind w:left="3600" w:hanging="360"/>
+      </w:pPr>
+      <w:rPr>
+        <w:rFonts w:ascii="Wingdings" w:hAnsi="Wingdings" w:hint="default"/>
+        <w:sz w:val="20"/>
+      </w:rPr>
+    </w:lvl>
+    <w:lvl w:ilvl="5" w:tentative="1">
+      <w:start w:val="1"/>
+      <w:numFmt w:val="bullet"/>
+      <w:lvlText w:val=""/>
+      <w:lvlJc w:val="left"/>
+      <w:pPr>
+        <w:tabs>
+          <w:tab w:val="num" w:pos="4320"/>
+        </w:tabs>
+        <w:ind w:left="4320" w:hanging="360"/>
+      </w:pPr>
+      <w:rPr>
+        <w:rFonts w:ascii="Wingdings" w:hAnsi="Wingdings" w:hint="default"/>
+        <w:sz w:val="20"/>
+      </w:rPr>
+    </w:lvl>
+    <w:lvl w:ilvl="6" w:tentative="1">
+      <w:start w:val="1"/>
+      <w:numFmt w:val="bullet"/>
+      <w:lvlText w:val=""/>
+      <w:lvlJc w:val="left"/>
+      <w:pPr>
+        <w:tabs>
+          <w:tab w:val="num" w:pos="5040"/>
+        </w:tabs>
+        <w:ind w:left="5040" w:hanging="360"/>
+      </w:pPr>
+      <w:rPr>
+        <w:rFonts w:ascii="Wingdings" w:hAnsi="Wingdings" w:hint="default"/>
+        <w:sz w:val="20"/>
+      </w:rPr>
+    </w:lvl>
+    <w:lvl w:ilvl="7" w:tentative="1">
+      <w:start w:val="1"/>
+      <w:numFmt w:val="bullet"/>
+      <w:lvlText w:val=""/>
+      <w:lvlJc w:val="left"/>
+      <w:pPr>
+        <w:tabs>
+          <w:tab w:val="num" w:pos="5760"/>
+        </w:tabs>
+        <w:ind w:left="5760" w:hanging="360"/>
+      </w:pPr>
+      <w:rPr>
+        <w:rFonts w:ascii="Wingdings" w:hAnsi="Wingdings" w:hint="default"/>
+        <w:sz w:val="20"/>
+      </w:rPr>
+    </w:lvl>
+    <w:lvl w:ilvl="8" w:tentative="1">
+      <w:start w:val="1"/>
+      <w:numFmt w:val="bullet"/>
+      <w:lvlText w:val=""/>
+      <w:lvlJc w:val="left"/>
+      <w:pPr>
+        <w:tabs>
+          <w:tab w:val="num" w:pos="6480"/>
+        </w:tabs>
+        <w:ind w:left="6480" w:hanging="360"/>
+      </w:pPr>
+      <w:rPr>
+        <w:rFonts w:ascii="Wingdings" w:hAnsi="Wingdings" w:hint="default"/>
+        <w:sz w:val="20"/>
+      </w:rPr>
+    </w:lvl>
+  </w:abstractNum>
+  <w:abstractNum w:abstractNumId="6" w15:restartNumberingAfterBreak="0">
+    <w:nsid w:val="41092F24"/>
+    <w:multiLevelType w:val="multilevel"/>
+    <w:tmpl w:val="4D46E50E"/>
+    <w:lvl w:ilvl="0">
+      <w:start w:val="1"/>
+      <w:numFmt w:val="bullet"/>
+      <w:lvlText w:val=""/>
+      <w:lvlJc w:val="left"/>
+      <w:pPr>
+        <w:tabs>
+          <w:tab w:val="num" w:pos="720"/>
+        </w:tabs>
+        <w:ind w:left="720" w:hanging="360"/>
+      </w:pPr>
+      <w:rPr>
+        <w:rFonts w:ascii="Symbol" w:hAnsi="Symbol" w:hint="default"/>
+        <w:sz w:val="20"/>
+      </w:rPr>
+    </w:lvl>
+    <w:lvl w:ilvl="1" w:tentative="1">
+      <w:start w:val="1"/>
+      <w:numFmt w:val="bullet"/>
+      <w:lvlText w:val="o"/>
+      <w:lvlJc w:val="left"/>
+      <w:pPr>
+        <w:tabs>
+          <w:tab w:val="num" w:pos="1440"/>
+        </w:tabs>
+        <w:ind w:left="1440" w:hanging="360"/>
+      </w:pPr>
+      <w:rPr>
+        <w:rFonts w:ascii="Courier New" w:hAnsi="Courier New" w:hint="default"/>
+        <w:sz w:val="20"/>
+      </w:rPr>
+    </w:lvl>
+    <w:lvl w:ilvl="2" w:tentative="1">
+      <w:start w:val="1"/>
+      <w:numFmt w:val="bullet"/>
+      <w:lvlText w:val=""/>
+      <w:lvlJc w:val="left"/>
+      <w:pPr>
+        <w:tabs>
+          <w:tab w:val="num" w:pos="2160"/>
+        </w:tabs>
+        <w:ind w:left="2160" w:hanging="360"/>
+      </w:pPr>
+      <w:rPr>
+        <w:rFonts w:ascii="Wingdings" w:hAnsi="Wingdings" w:hint="default"/>
+        <w:sz w:val="20"/>
+      </w:rPr>
+    </w:lvl>
+    <w:lvl w:ilvl="3" w:tentative="1">
+      <w:start w:val="1"/>
+      <w:numFmt w:val="bullet"/>
+      <w:lvlText w:val=""/>
+      <w:lvlJc w:val="left"/>
+      <w:pPr>
+        <w:tabs>
+          <w:tab w:val="num" w:pos="2880"/>
+        </w:tabs>
+        <w:ind w:left="2880" w:hanging="360"/>
+      </w:pPr>
+      <w:rPr>
+        <w:rFonts w:ascii="Wingdings" w:hAnsi="Wingdings" w:hint="default"/>
+        <w:sz w:val="20"/>
+      </w:rPr>
+    </w:lvl>
+    <w:lvl w:ilvl="4" w:tentative="1">
+      <w:start w:val="1"/>
+      <w:numFmt w:val="bullet"/>
+      <w:lvlText w:val=""/>
+      <w:lvlJc w:val="left"/>
+      <w:pPr>
+        <w:tabs>
+          <w:tab w:val="num" w:pos="3600"/>
+        </w:tabs>
+        <w:ind w:left="3600" w:hanging="360"/>
+      </w:pPr>
+      <w:rPr>
+        <w:rFonts w:ascii="Wingdings" w:hAnsi="Wingdings" w:hint="default"/>
+        <w:sz w:val="20"/>
+      </w:rPr>
+    </w:lvl>
+    <w:lvl w:ilvl="5" w:tentative="1">
+      <w:start w:val="1"/>
+      <w:numFmt w:val="bullet"/>
+      <w:lvlText w:val=""/>
+      <w:lvlJc w:val="left"/>
+      <w:pPr>
+        <w:tabs>
+          <w:tab w:val="num" w:pos="4320"/>
+        </w:tabs>
+        <w:ind w:left="4320" w:hanging="360"/>
+      </w:pPr>
+      <w:rPr>
+        <w:rFonts w:ascii="Wingdings" w:hAnsi="Wingdings" w:hint="default"/>
+        <w:sz w:val="20"/>
+      </w:rPr>
+    </w:lvl>
+    <w:lvl w:ilvl="6" w:tentative="1">
+      <w:start w:val="1"/>
+      <w:numFmt w:val="bullet"/>
+      <w:lvlText w:val=""/>
+      <w:lvlJc w:val="left"/>
+      <w:pPr>
+        <w:tabs>
+          <w:tab w:val="num" w:pos="5040"/>
+        </w:tabs>
+        <w:ind w:left="5040" w:hanging="360"/>
+      </w:pPr>
+      <w:rPr>
+        <w:rFonts w:ascii="Wingdings" w:hAnsi="Wingdings" w:hint="default"/>
+        <w:sz w:val="20"/>
+      </w:rPr>
+    </w:lvl>
+    <w:lvl w:ilvl="7" w:tentative="1">
+      <w:start w:val="1"/>
+      <w:numFmt w:val="bullet"/>
+      <w:lvlText w:val=""/>
+      <w:lvlJc w:val="left"/>
+      <w:pPr>
+        <w:tabs>
+          <w:tab w:val="num" w:pos="5760"/>
+        </w:tabs>
+        <w:ind w:left="5760" w:hanging="360"/>
+      </w:pPr>
+      <w:rPr>
+        <w:rFonts w:ascii="Wingdings" w:hAnsi="Wingdings" w:hint="default"/>
+        <w:sz w:val="20"/>
+      </w:rPr>
+    </w:lvl>
+    <w:lvl w:ilvl="8" w:tentative="1">
+      <w:start w:val="1"/>
+      <w:numFmt w:val="bullet"/>
+      <w:lvlText w:val=""/>
+      <w:lvlJc w:val="left"/>
+      <w:pPr>
+        <w:tabs>
+          <w:tab w:val="num" w:pos="6480"/>
+        </w:tabs>
+        <w:ind w:left="6480" w:hanging="360"/>
+      </w:pPr>
+      <w:rPr>
+        <w:rFonts w:ascii="Wingdings" w:hAnsi="Wingdings" w:hint="default"/>
+        <w:sz w:val="20"/>
+      </w:rPr>
+    </w:lvl>
+  </w:abstractNum>
+  <w:abstractNum w:abstractNumId="7" w15:restartNumberingAfterBreak="0">
     <w:nsid w:val="5AD02E90"/>
     <w:multiLevelType w:val="multilevel"/>
     <w:tmpl w:val="099CF6C4"/>
@@ -2971,7 +6352,156 @@
       </w:pPr>
     </w:lvl>
   </w:abstractNum>
-  <w:abstractNum w:abstractNumId="1" w15:restartNumberingAfterBreak="0">
+  <w:abstractNum w:abstractNumId="8" w15:restartNumberingAfterBreak="0">
+    <w:nsid w:val="609F0855"/>
+    <w:multiLevelType w:val="multilevel"/>
+    <w:tmpl w:val="C342393C"/>
+    <w:lvl w:ilvl="0">
+      <w:start w:val="1"/>
+      <w:numFmt w:val="bullet"/>
+      <w:lvlText w:val=""/>
+      <w:lvlJc w:val="left"/>
+      <w:pPr>
+        <w:tabs>
+          <w:tab w:val="num" w:pos="720"/>
+        </w:tabs>
+        <w:ind w:left="720" w:hanging="360"/>
+      </w:pPr>
+      <w:rPr>
+        <w:rFonts w:ascii="Symbol" w:hAnsi="Symbol" w:hint="default"/>
+        <w:sz w:val="20"/>
+      </w:rPr>
+    </w:lvl>
+    <w:lvl w:ilvl="1" w:tentative="1">
+      <w:start w:val="1"/>
+      <w:numFmt w:val="bullet"/>
+      <w:lvlText w:val="o"/>
+      <w:lvlJc w:val="left"/>
+      <w:pPr>
+        <w:tabs>
+          <w:tab w:val="num" w:pos="1440"/>
+        </w:tabs>
+        <w:ind w:left="1440" w:hanging="360"/>
+      </w:pPr>
+      <w:rPr>
+        <w:rFonts w:ascii="Courier New" w:hAnsi="Courier New" w:hint="default"/>
+        <w:sz w:val="20"/>
+      </w:rPr>
+    </w:lvl>
+    <w:lvl w:ilvl="2" w:tentative="1">
+      <w:start w:val="1"/>
+      <w:numFmt w:val="bullet"/>
+      <w:lvlText w:val=""/>
+      <w:lvlJc w:val="left"/>
+      <w:pPr>
+        <w:tabs>
+          <w:tab w:val="num" w:pos="2160"/>
+        </w:tabs>
+        <w:ind w:left="2160" w:hanging="360"/>
+      </w:pPr>
+      <w:rPr>
+        <w:rFonts w:ascii="Wingdings" w:hAnsi="Wingdings" w:hint="default"/>
+        <w:sz w:val="20"/>
+      </w:rPr>
+    </w:lvl>
+    <w:lvl w:ilvl="3" w:tentative="1">
+      <w:start w:val="1"/>
+      <w:numFmt w:val="bullet"/>
+      <w:lvlText w:val=""/>
+      <w:lvlJc w:val="left"/>
+      <w:pPr>
+        <w:tabs>
+          <w:tab w:val="num" w:pos="2880"/>
+        </w:tabs>
+        <w:ind w:left="2880" w:hanging="360"/>
+      </w:pPr>
+      <w:rPr>
+        <w:rFonts w:ascii="Wingdings" w:hAnsi="Wingdings" w:hint="default"/>
+        <w:sz w:val="20"/>
+      </w:rPr>
+    </w:lvl>
+    <w:lvl w:ilvl="4" w:tentative="1">
+      <w:start w:val="1"/>
+      <w:numFmt w:val="bullet"/>
+      <w:lvlText w:val=""/>
+      <w:lvlJc w:val="left"/>
+      <w:pPr>
+        <w:tabs>
+          <w:tab w:val="num" w:pos="3600"/>
+        </w:tabs>
+        <w:ind w:left="3600" w:hanging="360"/>
+      </w:pPr>
+      <w:rPr>
+        <w:rFonts w:ascii="Wingdings" w:hAnsi="Wingdings" w:hint="default"/>
+        <w:sz w:val="20"/>
+      </w:rPr>
+    </w:lvl>
+    <w:lvl w:ilvl="5" w:tentative="1">
+      <w:start w:val="1"/>
+      <w:numFmt w:val="bullet"/>
+      <w:lvlText w:val=""/>
+      <w:lvlJc w:val="left"/>
+      <w:pPr>
+        <w:tabs>
+          <w:tab w:val="num" w:pos="4320"/>
+        </w:tabs>
+        <w:ind w:left="4320" w:hanging="360"/>
+      </w:pPr>
+      <w:rPr>
+        <w:rFonts w:ascii="Wingdings" w:hAnsi="Wingdings" w:hint="default"/>
+        <w:sz w:val="20"/>
+      </w:rPr>
+    </w:lvl>
+    <w:lvl w:ilvl="6" w:tentative="1">
+      <w:start w:val="1"/>
+      <w:numFmt w:val="bullet"/>
+      <w:lvlText w:val=""/>
+      <w:lvlJc w:val="left"/>
+      <w:pPr>
+        <w:tabs>
+          <w:tab w:val="num" w:pos="5040"/>
+        </w:tabs>
+        <w:ind w:left="5040" w:hanging="360"/>
+      </w:pPr>
+      <w:rPr>
+        <w:rFonts w:ascii="Wingdings" w:hAnsi="Wingdings" w:hint="default"/>
+        <w:sz w:val="20"/>
+      </w:rPr>
+    </w:lvl>
+    <w:lvl w:ilvl="7" w:tentative="1">
+      <w:start w:val="1"/>
+      <w:numFmt w:val="bullet"/>
+      <w:lvlText w:val=""/>
+      <w:lvlJc w:val="left"/>
+      <w:pPr>
+        <w:tabs>
+          <w:tab w:val="num" w:pos="5760"/>
+        </w:tabs>
+        <w:ind w:left="5760" w:hanging="360"/>
+      </w:pPr>
+      <w:rPr>
+        <w:rFonts w:ascii="Wingdings" w:hAnsi="Wingdings" w:hint="default"/>
+        <w:sz w:val="20"/>
+      </w:rPr>
+    </w:lvl>
+    <w:lvl w:ilvl="8" w:tentative="1">
+      <w:start w:val="1"/>
+      <w:numFmt w:val="bullet"/>
+      <w:lvlText w:val=""/>
+      <w:lvlJc w:val="left"/>
+      <w:pPr>
+        <w:tabs>
+          <w:tab w:val="num" w:pos="6480"/>
+        </w:tabs>
+        <w:ind w:left="6480" w:hanging="360"/>
+      </w:pPr>
+      <w:rPr>
+        <w:rFonts w:ascii="Wingdings" w:hAnsi="Wingdings" w:hint="default"/>
+        <w:sz w:val="20"/>
+      </w:rPr>
+    </w:lvl>
+  </w:abstractNum>
+  <w:abstractNum w:abstractNumId="9" w15:restartNumberingAfterBreak="0">
     <w:nsid w:val="6298379A"/>
     <w:multiLevelType w:val="multilevel"/>
     <w:tmpl w:val="927C0A04"/>
@@ -3092,7 +6622,7 @@
       </w:pPr>
     </w:lvl>
   </w:abstractNum>
-  <w:abstractNum w:abstractNumId="2" w15:restartNumberingAfterBreak="0">
+  <w:abstractNum w:abstractNumId="10" w15:restartNumberingAfterBreak="0">
     <w:nsid w:val="66ED4E2A"/>
     <w:multiLevelType w:val="multilevel"/>
     <w:tmpl w:val="CFC0A502"/>
@@ -3241,14 +6771,190 @@
       </w:rPr>
     </w:lvl>
   </w:abstractNum>
+  <w:abstractNum w:abstractNumId="11" w15:restartNumberingAfterBreak="0">
+    <w:nsid w:val="6791054A"/>
+    <w:multiLevelType w:val="multilevel"/>
+    <w:tmpl w:val="54FCC3B4"/>
+    <w:lvl w:ilvl="0">
+      <w:start w:val="1"/>
+      <w:numFmt w:val="bullet"/>
+      <w:lvlText w:val=""/>
+      <w:lvlJc w:val="left"/>
+      <w:pPr>
+        <w:tabs>
+          <w:tab w:val="num" w:pos="720"/>
+        </w:tabs>
+        <w:ind w:left="720" w:hanging="360"/>
+      </w:pPr>
+      <w:rPr>
+        <w:rFonts w:ascii="Symbol" w:hAnsi="Symbol" w:hint="default"/>
+        <w:sz w:val="20"/>
+      </w:rPr>
+    </w:lvl>
+    <w:lvl w:ilvl="1" w:tentative="1">
+      <w:start w:val="1"/>
+      <w:numFmt w:val="bullet"/>
+      <w:lvlText w:val="o"/>
+      <w:lvlJc w:val="left"/>
+      <w:pPr>
+        <w:tabs>
+          <w:tab w:val="num" w:pos="1440"/>
+        </w:tabs>
+        <w:ind w:left="1440" w:hanging="360"/>
+      </w:pPr>
+      <w:rPr>
+        <w:rFonts w:ascii="Courier New" w:hAnsi="Courier New" w:hint="default"/>
+        <w:sz w:val="20"/>
+      </w:rPr>
+    </w:lvl>
+    <w:lvl w:ilvl="2" w:tentative="1">
+      <w:start w:val="1"/>
+      <w:numFmt w:val="bullet"/>
+      <w:lvlText w:val=""/>
+      <w:lvlJc w:val="left"/>
+      <w:pPr>
+        <w:tabs>
+          <w:tab w:val="num" w:pos="2160"/>
+        </w:tabs>
+        <w:ind w:left="2160" w:hanging="360"/>
+      </w:pPr>
+      <w:rPr>
+        <w:rFonts w:ascii="Wingdings" w:hAnsi="Wingdings" w:hint="default"/>
+        <w:sz w:val="20"/>
+      </w:rPr>
+    </w:lvl>
+    <w:lvl w:ilvl="3" w:tentative="1">
+      <w:start w:val="1"/>
+      <w:numFmt w:val="bullet"/>
+      <w:lvlText w:val=""/>
+      <w:lvlJc w:val="left"/>
+      <w:pPr>
+        <w:tabs>
+          <w:tab w:val="num" w:pos="2880"/>
+        </w:tabs>
+        <w:ind w:left="2880" w:hanging="360"/>
+      </w:pPr>
+      <w:rPr>
+        <w:rFonts w:ascii="Wingdings" w:hAnsi="Wingdings" w:hint="default"/>
+        <w:sz w:val="20"/>
+      </w:rPr>
+    </w:lvl>
+    <w:lvl w:ilvl="4" w:tentative="1">
+      <w:start w:val="1"/>
+      <w:numFmt w:val="bullet"/>
+      <w:lvlText w:val=""/>
+      <w:lvlJc w:val="left"/>
+      <w:pPr>
+        <w:tabs>
+          <w:tab w:val="num" w:pos="3600"/>
+        </w:tabs>
+        <w:ind w:left="3600" w:hanging="360"/>
+      </w:pPr>
+      <w:rPr>
+        <w:rFonts w:ascii="Wingdings" w:hAnsi="Wingdings" w:hint="default"/>
+        <w:sz w:val="20"/>
+      </w:rPr>
+    </w:lvl>
+    <w:lvl w:ilvl="5" w:tentative="1">
+      <w:start w:val="1"/>
+      <w:numFmt w:val="bullet"/>
+      <w:lvlText w:val=""/>
+      <w:lvlJc w:val="left"/>
+      <w:pPr>
+        <w:tabs>
+          <w:tab w:val="num" w:pos="4320"/>
+        </w:tabs>
+        <w:ind w:left="4320" w:hanging="360"/>
+      </w:pPr>
+      <w:rPr>
+        <w:rFonts w:ascii="Wingdings" w:hAnsi="Wingdings" w:hint="default"/>
+        <w:sz w:val="20"/>
+      </w:rPr>
+    </w:lvl>
+    <w:lvl w:ilvl="6" w:tentative="1">
+      <w:start w:val="1"/>
+      <w:numFmt w:val="bullet"/>
+      <w:lvlText w:val=""/>
+      <w:lvlJc w:val="left"/>
+      <w:pPr>
+        <w:tabs>
+          <w:tab w:val="num" w:pos="5040"/>
+        </w:tabs>
+        <w:ind w:left="5040" w:hanging="360"/>
+      </w:pPr>
+      <w:rPr>
+        <w:rFonts w:ascii="Wingdings" w:hAnsi="Wingdings" w:hint="default"/>
+        <w:sz w:val="20"/>
+      </w:rPr>
+    </w:lvl>
+    <w:lvl w:ilvl="7" w:tentative="1">
+      <w:start w:val="1"/>
+      <w:numFmt w:val="bullet"/>
+      <w:lvlText w:val=""/>
+      <w:lvlJc w:val="left"/>
+      <w:pPr>
+        <w:tabs>
+          <w:tab w:val="num" w:pos="5760"/>
+        </w:tabs>
+        <w:ind w:left="5760" w:hanging="360"/>
+      </w:pPr>
+      <w:rPr>
+        <w:rFonts w:ascii="Wingdings" w:hAnsi="Wingdings" w:hint="default"/>
+        <w:sz w:val="20"/>
+      </w:rPr>
+    </w:lvl>
+    <w:lvl w:ilvl="8" w:tentative="1">
+      <w:start w:val="1"/>
+      <w:numFmt w:val="bullet"/>
+      <w:lvlText w:val=""/>
+      <w:lvlJc w:val="left"/>
+      <w:pPr>
+        <w:tabs>
+          <w:tab w:val="num" w:pos="6480"/>
+        </w:tabs>
+        <w:ind w:left="6480" w:hanging="360"/>
+      </w:pPr>
+      <w:rPr>
+        <w:rFonts w:ascii="Wingdings" w:hAnsi="Wingdings" w:hint="default"/>
+        <w:sz w:val="20"/>
+      </w:rPr>
+    </w:lvl>
+  </w:abstractNum>
   <w:num w:numId="1" w16cid:durableId="1555509092">
+    <w:abstractNumId w:val="9"/>
+  </w:num>
+  <w:num w:numId="2" w16cid:durableId="839010057">
+    <w:abstractNumId w:val="7"/>
+  </w:num>
+  <w:num w:numId="3" w16cid:durableId="1971670181">
+    <w:abstractNumId w:val="10"/>
+  </w:num>
+  <w:num w:numId="4" w16cid:durableId="1767461249">
+    <w:abstractNumId w:val="2"/>
+  </w:num>
+  <w:num w:numId="5" w16cid:durableId="1845657565">
+    <w:abstractNumId w:val="0"/>
+  </w:num>
+  <w:num w:numId="6" w16cid:durableId="1892302262">
+    <w:abstractNumId w:val="4"/>
+  </w:num>
+  <w:num w:numId="7" w16cid:durableId="2102139104">
+    <w:abstractNumId w:val="6"/>
+  </w:num>
+  <w:num w:numId="8" w16cid:durableId="1566186641">
+    <w:abstractNumId w:val="3"/>
+  </w:num>
+  <w:num w:numId="9" w16cid:durableId="1860315254">
     <w:abstractNumId w:val="1"/>
   </w:num>
-  <w:num w:numId="2" w16cid:durableId="839010057">
-    <w:abstractNumId w:val="0"/>
+  <w:num w:numId="10" w16cid:durableId="500001115">
+    <w:abstractNumId w:val="8"/>
   </w:num>
-  <w:num w:numId="3" w16cid:durableId="1971670181">
-    <w:abstractNumId w:val="2"/>
+  <w:num w:numId="11" w16cid:durableId="747074083">
+    <w:abstractNumId w:val="5"/>
+  </w:num>
+  <w:num w:numId="12" w16cid:durableId="863594542">
+    <w:abstractNumId w:val="11"/>
   </w:num>
 </w:numbering>
 </file>

</xml_diff>